<commit_message>
add doc, fix UI
</commit_message>
<xml_diff>
--- a/Doc/Mo_ta_Tong_quan_Actor_va_Usecase.docx
+++ b/Doc/Mo_ta_Tong_quan_Actor_va_Usecase.docx
@@ -1784,7 +1784,251 @@
           </w:tcPr>
           <w:p>
             <w:pPr>
+              <w:spacing w:before="40" w:after="40" w:line="276" w:lineRule="auto"/>
+            </w:pPr>
+            <w:r/>
+            <w:r>
+              <w:rPr>
+                <w:rFonts w:ascii="Times New Roman" w:hAnsi="Times New Roman"/>
+                <w:b w:val="0"/>
+                <w:i w:val="0"/>
+                <w:color w:val="1E293B"/>
+                <w:sz w:val="20"/>
+              </w:rPr>
+              <w:t>2</w:t>
+            </w:r>
+          </w:p>
+        </w:tc>
+        <w:tc>
+          <w:tcPr>
+            <w:tcW w:w="1028" w:type="dxa"/>
+            <w:tcBorders>
+              <w:top w:val="single" w:sz="4" w:space="0" w:color="000000"/>
+              <w:left w:val="single" w:sz="4" w:space="0" w:color="000000"/>
+              <w:bottom w:val="single" w:sz="4" w:space="0" w:color="000000"/>
+              <w:right w:val="single" w:sz="4" w:space="0" w:color="000000"/>
+            </w:tcBorders>
+            <w:tcMar>
+              <w:top w:w="0" w:type="dxa"/>
+              <w:left w:w="99" w:type="dxa"/>
+              <w:bottom w:w="0" w:type="dxa"/>
+              <w:right w:w="99" w:type="dxa"/>
+            </w:tcMar>
+            <w:vAlign w:val="center"/>
+          </w:tcPr>
+          <w:p>
+            <w:pPr>
+              <w:spacing w:before="40" w:after="40" w:line="276" w:lineRule="auto"/>
+            </w:pPr>
+            <w:r/>
+            <w:r>
+              <w:rPr>
+                <w:rFonts w:ascii="Times New Roman" w:hAnsi="Times New Roman"/>
+                <w:b w:val="0"/>
+                <w:i w:val="0"/>
+                <w:color w:val="1E293B"/>
+                <w:sz w:val="20"/>
+              </w:rPr>
+              <w:t>Ver1.1</w:t>
+            </w:r>
+          </w:p>
+        </w:tc>
+        <w:tc>
+          <w:tcPr>
+            <w:tcW w:w="1349" w:type="dxa"/>
+            <w:tcBorders>
+              <w:top w:val="single" w:sz="4" w:space="0" w:color="000000"/>
+              <w:left w:val="single" w:sz="4" w:space="0" w:color="000000"/>
+              <w:bottom w:val="single" w:sz="4" w:space="0" w:color="000000"/>
+              <w:right w:val="single" w:sz="4" w:space="0" w:color="000000"/>
+            </w:tcBorders>
+            <w:tcMar>
+              <w:top w:w="0" w:type="dxa"/>
+              <w:left w:w="99" w:type="dxa"/>
+              <w:bottom w:w="0" w:type="dxa"/>
+              <w:right w:w="99" w:type="dxa"/>
+            </w:tcMar>
+            <w:vAlign w:val="center"/>
+          </w:tcPr>
+          <w:p>
+            <w:pPr>
+              <w:spacing w:before="40" w:after="40" w:line="276" w:lineRule="auto"/>
+            </w:pPr>
+            <w:r/>
+            <w:r>
+              <w:rPr>
+                <w:rFonts w:ascii="Times New Roman" w:hAnsi="Times New Roman"/>
+                <w:b w:val="0"/>
+                <w:i w:val="0"/>
+                <w:color w:val="1E293B"/>
+                <w:sz w:val="20"/>
+              </w:rPr>
+              <w:t>30/09/2026</w:t>
+            </w:r>
+          </w:p>
+        </w:tc>
+        <w:tc>
+          <w:tcPr>
+            <w:tcW w:w="1369" w:type="dxa"/>
+            <w:tcBorders>
+              <w:top w:val="single" w:sz="4" w:space="0" w:color="000000"/>
+              <w:left w:val="single" w:sz="4" w:space="0" w:color="000000"/>
+              <w:bottom w:val="single" w:sz="4" w:space="0" w:color="000000"/>
+              <w:right w:val="single" w:sz="4" w:space="0" w:color="000000"/>
+            </w:tcBorders>
+            <w:tcMar>
+              <w:top w:w="0" w:type="dxa"/>
+              <w:left w:w="99" w:type="dxa"/>
+              <w:bottom w:w="0" w:type="dxa"/>
+              <w:right w:w="99" w:type="dxa"/>
+            </w:tcMar>
+            <w:vAlign w:val="center"/>
+          </w:tcPr>
+          <w:p>
+            <w:pPr>
+              <w:spacing w:before="40" w:after="40" w:line="276" w:lineRule="auto"/>
+            </w:pPr>
+            <w:r/>
+            <w:r>
+              <w:rPr>
+                <w:rFonts w:ascii="Times New Roman" w:hAnsi="Times New Roman"/>
+                <w:b w:val="0"/>
+                <w:i w:val="0"/>
+                <w:color w:val="1E293B"/>
+                <w:sz w:val="20"/>
+              </w:rPr>
+              <w:t>Cập nhật</w:t>
+            </w:r>
+          </w:p>
+        </w:tc>
+        <w:tc>
+          <w:tcPr>
+            <w:tcW w:w="1680" w:type="dxa"/>
+            <w:tcBorders>
+              <w:top w:val="single" w:sz="4" w:space="0" w:color="000000"/>
+              <w:left w:val="single" w:sz="4" w:space="0" w:color="000000"/>
+              <w:bottom w:val="single" w:sz="4" w:space="0" w:color="000000"/>
+              <w:right w:val="single" w:sz="4" w:space="0" w:color="000000"/>
+            </w:tcBorders>
+            <w:tcMar>
+              <w:top w:w="0" w:type="dxa"/>
+              <w:left w:w="99" w:type="dxa"/>
+              <w:bottom w:w="0" w:type="dxa"/>
+              <w:right w:w="99" w:type="dxa"/>
+            </w:tcMar>
+            <w:vAlign w:val="center"/>
+          </w:tcPr>
+          <w:p>
+            <w:pPr>
+              <w:spacing w:before="40" w:after="40" w:line="276" w:lineRule="auto"/>
+            </w:pPr>
+            <w:r/>
+            <w:r>
+              <w:rPr>
+                <w:rFonts w:ascii="Times New Roman" w:hAnsi="Times New Roman"/>
+                <w:b w:val="0"/>
+                <w:i w:val="0"/>
+                <w:color w:val="1E293B"/>
+                <w:sz w:val="20"/>
+              </w:rPr>
+              <w:t>Hoàn thiện chi tiết mô tả ngắn gọn các use case theo nghiệp vụ thực tế</w:t>
+            </w:r>
+          </w:p>
+        </w:tc>
+        <w:tc>
+          <w:tcPr>
+            <w:tcW w:w="1575" w:type="dxa"/>
+            <w:tcBorders>
+              <w:top w:val="single" w:sz="4" w:space="0" w:color="000000"/>
+              <w:left w:val="single" w:sz="4" w:space="0" w:color="000000"/>
+              <w:bottom w:val="single" w:sz="4" w:space="0" w:color="000000"/>
+              <w:right w:val="single" w:sz="4" w:space="0" w:color="000000"/>
+            </w:tcBorders>
+            <w:tcMar>
+              <w:top w:w="0" w:type="dxa"/>
+              <w:left w:w="99" w:type="dxa"/>
+              <w:bottom w:w="0" w:type="dxa"/>
+              <w:right w:w="99" w:type="dxa"/>
+            </w:tcMar>
+            <w:vAlign w:val="center"/>
+          </w:tcPr>
+          <w:p>
+            <w:pPr>
+              <w:spacing w:before="40" w:after="40" w:line="276" w:lineRule="auto"/>
+            </w:pPr>
+            <w:r/>
+            <w:r>
+              <w:rPr>
+                <w:rFonts w:ascii="Times New Roman" w:hAnsi="Times New Roman"/>
+                <w:b w:val="0"/>
+                <w:i w:val="0"/>
+                <w:color w:val="1E293B"/>
+                <w:sz w:val="20"/>
+              </w:rPr>
+              <w:t>Tạ Quang Chiến</w:t>
+            </w:r>
+          </w:p>
+        </w:tc>
+        <w:tc>
+          <w:tcPr>
+            <w:tcW w:w="2186" w:type="dxa"/>
+            <w:tcBorders>
+              <w:top w:val="single" w:sz="4" w:space="0" w:color="000000"/>
+              <w:left w:val="single" w:sz="4" w:space="0" w:color="000000"/>
+              <w:bottom w:val="single" w:sz="4" w:space="0" w:color="000000"/>
+              <w:right w:val="single" w:sz="4" w:space="0" w:color="000000"/>
+            </w:tcBorders>
+            <w:tcMar>
+              <w:top w:w="0" w:type="dxa"/>
+              <w:left w:w="99" w:type="dxa"/>
+              <w:bottom w:w="0" w:type="dxa"/>
+              <w:right w:w="99" w:type="dxa"/>
+            </w:tcMar>
+            <w:vAlign w:val="center"/>
+          </w:tcPr>
+          <w:p>
+            <w:pPr>
+              <w:spacing w:before="40" w:after="40" w:line="276" w:lineRule="auto"/>
+            </w:pPr>
+            <w:r/>
+            <w:r>
+              <w:rPr>
+                <w:rFonts w:ascii="Times New Roman" w:hAnsi="Times New Roman"/>
+                <w:b w:val="0"/>
+                <w:i w:val="0"/>
+                <w:color w:val="1E293B"/>
+                <w:sz w:val="20"/>
+              </w:rPr>
+              <w:t>Lưu Xuân Bắc</w:t>
+            </w:r>
+          </w:p>
+        </w:tc>
+      </w:tr>
+      <w:tr>
+        <w:trPr>
+          <w:trHeight w:val="389"/>
+        </w:trPr>
+        <w:tc>
+          <w:tcPr>
+            <w:tcW w:w="438" w:type="dxa"/>
+            <w:tcBorders>
+              <w:top w:val="single" w:sz="4" w:space="0" w:color="000000"/>
+              <w:left w:val="single" w:sz="4" w:space="0" w:color="000000"/>
+              <w:bottom w:val="single" w:sz="4" w:space="0" w:color="000000"/>
+              <w:right w:val="single" w:sz="4" w:space="0" w:color="000000"/>
+            </w:tcBorders>
+            <w:tcMar>
+              <w:top w:w="0" w:type="dxa"/>
+              <w:left w:w="99" w:type="dxa"/>
+              <w:bottom w:w="0" w:type="dxa"/>
+              <w:right w:w="99" w:type="dxa"/>
+            </w:tcMar>
+            <w:vAlign w:val="center"/>
+          </w:tcPr>
+          <w:p>
+            <w:pPr>
               <w:spacing w:after="0" w:line="240" w:lineRule="auto"/>
+              <w:jc w:val="center"/>
               <w:rPr>
                 <w:rFonts w:ascii="Calibri" w:eastAsia="Calibri" w:hAnsi="Calibri" w:cs="Calibri"/>
                 <w:sz w:val="20"/>
@@ -1993,12 +2237,10 @@
           <w:p>
             <w:pPr>
               <w:spacing w:after="0" w:line="240" w:lineRule="auto"/>
-              <w:jc w:val="center"/>
-              <w:rPr>
-                <w:rFonts w:ascii="Calibri" w:eastAsia="Calibri" w:hAnsi="Calibri" w:cs="Calibri"/>
-                <w:sz w:val="20"/>
-                <w:szCs w:val="20"/>
-                <w:lang w:val="vi-VN"/>
+              <w:rPr>
+                <w:rFonts w:ascii="Calibri" w:eastAsia="Calibri" w:hAnsi="Calibri" w:cs="Calibri"/>
+                <w:sz w:val="24"/>
+                <w:szCs w:val="24"/>
               </w:rPr>
             </w:pPr>
           </w:p>
@@ -2023,11 +2265,10 @@
           <w:p>
             <w:pPr>
               <w:spacing w:after="0" w:line="240" w:lineRule="auto"/>
-              <w:jc w:val="center"/>
-              <w:rPr>
-                <w:rFonts w:ascii="Calibri" w:eastAsia="Calibri" w:hAnsi="Calibri" w:cs="Calibri"/>
-                <w:sz w:val="20"/>
-                <w:szCs w:val="20"/>
+              <w:rPr>
+                <w:rFonts w:ascii="Calibri" w:eastAsia="Calibri" w:hAnsi="Calibri" w:cs="Calibri"/>
+                <w:sz w:val="24"/>
+                <w:szCs w:val="24"/>
               </w:rPr>
             </w:pPr>
           </w:p>
@@ -2052,11 +2293,10 @@
           <w:p>
             <w:pPr>
               <w:spacing w:after="0" w:line="240" w:lineRule="auto"/>
-              <w:jc w:val="center"/>
-              <w:rPr>
-                <w:rFonts w:ascii="Calibri" w:eastAsia="Calibri" w:hAnsi="Calibri" w:cs="Calibri"/>
-                <w:sz w:val="20"/>
-                <w:szCs w:val="20"/>
+              <w:rPr>
+                <w:rFonts w:ascii="Calibri" w:eastAsia="Calibri" w:hAnsi="Calibri" w:cs="Calibri"/>
+                <w:sz w:val="24"/>
+                <w:szCs w:val="24"/>
               </w:rPr>
             </w:pPr>
           </w:p>
@@ -2081,11 +2321,10 @@
           <w:p>
             <w:pPr>
               <w:spacing w:after="0" w:line="240" w:lineRule="auto"/>
-              <w:jc w:val="center"/>
-              <w:rPr>
-                <w:rFonts w:ascii="Calibri" w:eastAsia="Calibri" w:hAnsi="Calibri" w:cs="Calibri"/>
-                <w:sz w:val="20"/>
-                <w:szCs w:val="20"/>
+              <w:rPr>
+                <w:rFonts w:ascii="Calibri" w:eastAsia="Calibri" w:hAnsi="Calibri" w:cs="Calibri"/>
+                <w:sz w:val="24"/>
+                <w:szCs w:val="24"/>
               </w:rPr>
             </w:pPr>
           </w:p>
@@ -2110,11 +2349,10 @@
           <w:p>
             <w:pPr>
               <w:spacing w:after="0" w:line="240" w:lineRule="auto"/>
-              <w:jc w:val="center"/>
-              <w:rPr>
-                <w:rFonts w:ascii="Calibri" w:eastAsia="Calibri" w:hAnsi="Calibri" w:cs="Calibri"/>
-                <w:sz w:val="20"/>
-                <w:szCs w:val="20"/>
+              <w:rPr>
+                <w:rFonts w:ascii="Calibri" w:eastAsia="Calibri" w:hAnsi="Calibri" w:cs="Calibri"/>
+                <w:sz w:val="24"/>
+                <w:szCs w:val="24"/>
               </w:rPr>
             </w:pPr>
           </w:p>
@@ -2139,11 +2377,10 @@
           <w:p>
             <w:pPr>
               <w:spacing w:after="0" w:line="240" w:lineRule="auto"/>
-              <w:jc w:val="center"/>
-              <w:rPr>
-                <w:rFonts w:ascii="Calibri" w:eastAsia="Calibri" w:hAnsi="Calibri" w:cs="Calibri"/>
-                <w:sz w:val="20"/>
-                <w:szCs w:val="20"/>
+              <w:rPr>
+                <w:rFonts w:ascii="Calibri" w:eastAsia="Calibri" w:hAnsi="Calibri" w:cs="Calibri"/>
+                <w:sz w:val="24"/>
+                <w:szCs w:val="24"/>
               </w:rPr>
             </w:pPr>
           </w:p>
@@ -2168,11 +2405,10 @@
           <w:p>
             <w:pPr>
               <w:spacing w:after="0" w:line="240" w:lineRule="auto"/>
-              <w:jc w:val="center"/>
-              <w:rPr>
-                <w:rFonts w:ascii="Calibri" w:eastAsia="Calibri" w:hAnsi="Calibri" w:cs="Calibri"/>
-                <w:sz w:val="20"/>
-                <w:szCs w:val="20"/>
+              <w:rPr>
+                <w:rFonts w:ascii="Calibri" w:eastAsia="Calibri" w:hAnsi="Calibri" w:cs="Calibri"/>
+                <w:sz w:val="24"/>
+                <w:szCs w:val="24"/>
               </w:rPr>
             </w:pPr>
           </w:p>
@@ -6600,207 +6836,6 @@
           </w:p>
         </w:tc>
       </w:tr>
-      <w:tr>
-        <w:trPr>
-          <w:trHeight w:val="389"/>
-        </w:trPr>
-        <w:tc>
-          <w:tcPr>
-            <w:tcW w:w="438" w:type="dxa"/>
-            <w:tcBorders>
-              <w:top w:val="single" w:sz="4" w:space="0" w:color="000000"/>
-              <w:left w:val="single" w:sz="4" w:space="0" w:color="000000"/>
-              <w:bottom w:val="single" w:sz="4" w:space="0" w:color="000000"/>
-              <w:right w:val="single" w:sz="4" w:space="0" w:color="000000"/>
-            </w:tcBorders>
-            <w:tcMar>
-              <w:top w:w="0" w:type="dxa"/>
-              <w:left w:w="99" w:type="dxa"/>
-              <w:bottom w:w="0" w:type="dxa"/>
-              <w:right w:w="99" w:type="dxa"/>
-            </w:tcMar>
-            <w:vAlign w:val="center"/>
-          </w:tcPr>
-          <w:p>
-            <w:pPr>
-              <w:spacing w:after="0" w:line="240" w:lineRule="auto"/>
-              <w:rPr>
-                <w:rFonts w:ascii="Calibri" w:eastAsia="Calibri" w:hAnsi="Calibri" w:cs="Calibri"/>
-                <w:sz w:val="24"/>
-                <w:szCs w:val="24"/>
-              </w:rPr>
-            </w:pPr>
-          </w:p>
-        </w:tc>
-        <w:tc>
-          <w:tcPr>
-            <w:tcW w:w="1028" w:type="dxa"/>
-            <w:tcBorders>
-              <w:top w:val="single" w:sz="4" w:space="0" w:color="000000"/>
-              <w:left w:val="single" w:sz="4" w:space="0" w:color="000000"/>
-              <w:bottom w:val="single" w:sz="4" w:space="0" w:color="000000"/>
-              <w:right w:val="single" w:sz="4" w:space="0" w:color="000000"/>
-            </w:tcBorders>
-            <w:tcMar>
-              <w:top w:w="0" w:type="dxa"/>
-              <w:left w:w="99" w:type="dxa"/>
-              <w:bottom w:w="0" w:type="dxa"/>
-              <w:right w:w="99" w:type="dxa"/>
-            </w:tcMar>
-            <w:vAlign w:val="center"/>
-          </w:tcPr>
-          <w:p>
-            <w:pPr>
-              <w:spacing w:after="0" w:line="240" w:lineRule="auto"/>
-              <w:rPr>
-                <w:rFonts w:ascii="Calibri" w:eastAsia="Calibri" w:hAnsi="Calibri" w:cs="Calibri"/>
-                <w:sz w:val="24"/>
-                <w:szCs w:val="24"/>
-              </w:rPr>
-            </w:pPr>
-          </w:p>
-        </w:tc>
-        <w:tc>
-          <w:tcPr>
-            <w:tcW w:w="1349" w:type="dxa"/>
-            <w:tcBorders>
-              <w:top w:val="single" w:sz="4" w:space="0" w:color="000000"/>
-              <w:left w:val="single" w:sz="4" w:space="0" w:color="000000"/>
-              <w:bottom w:val="single" w:sz="4" w:space="0" w:color="000000"/>
-              <w:right w:val="single" w:sz="4" w:space="0" w:color="000000"/>
-            </w:tcBorders>
-            <w:tcMar>
-              <w:top w:w="0" w:type="dxa"/>
-              <w:left w:w="99" w:type="dxa"/>
-              <w:bottom w:w="0" w:type="dxa"/>
-              <w:right w:w="99" w:type="dxa"/>
-            </w:tcMar>
-            <w:vAlign w:val="center"/>
-          </w:tcPr>
-          <w:p>
-            <w:pPr>
-              <w:spacing w:after="0" w:line="240" w:lineRule="auto"/>
-              <w:rPr>
-                <w:rFonts w:ascii="Calibri" w:eastAsia="Calibri" w:hAnsi="Calibri" w:cs="Calibri"/>
-                <w:sz w:val="24"/>
-                <w:szCs w:val="24"/>
-              </w:rPr>
-            </w:pPr>
-          </w:p>
-        </w:tc>
-        <w:tc>
-          <w:tcPr>
-            <w:tcW w:w="1369" w:type="dxa"/>
-            <w:tcBorders>
-              <w:top w:val="single" w:sz="4" w:space="0" w:color="000000"/>
-              <w:left w:val="single" w:sz="4" w:space="0" w:color="000000"/>
-              <w:bottom w:val="single" w:sz="4" w:space="0" w:color="000000"/>
-              <w:right w:val="single" w:sz="4" w:space="0" w:color="000000"/>
-            </w:tcBorders>
-            <w:tcMar>
-              <w:top w:w="0" w:type="dxa"/>
-              <w:left w:w="99" w:type="dxa"/>
-              <w:bottom w:w="0" w:type="dxa"/>
-              <w:right w:w="99" w:type="dxa"/>
-            </w:tcMar>
-            <w:vAlign w:val="center"/>
-          </w:tcPr>
-          <w:p>
-            <w:pPr>
-              <w:spacing w:after="0" w:line="240" w:lineRule="auto"/>
-              <w:rPr>
-                <w:rFonts w:ascii="Calibri" w:eastAsia="Calibri" w:hAnsi="Calibri" w:cs="Calibri"/>
-                <w:sz w:val="24"/>
-                <w:szCs w:val="24"/>
-              </w:rPr>
-            </w:pPr>
-          </w:p>
-        </w:tc>
-        <w:tc>
-          <w:tcPr>
-            <w:tcW w:w="1680" w:type="dxa"/>
-            <w:tcBorders>
-              <w:top w:val="single" w:sz="4" w:space="0" w:color="000000"/>
-              <w:left w:val="single" w:sz="4" w:space="0" w:color="000000"/>
-              <w:bottom w:val="single" w:sz="4" w:space="0" w:color="000000"/>
-              <w:right w:val="single" w:sz="4" w:space="0" w:color="000000"/>
-            </w:tcBorders>
-            <w:tcMar>
-              <w:top w:w="0" w:type="dxa"/>
-              <w:left w:w="99" w:type="dxa"/>
-              <w:bottom w:w="0" w:type="dxa"/>
-              <w:right w:w="99" w:type="dxa"/>
-            </w:tcMar>
-            <w:vAlign w:val="center"/>
-          </w:tcPr>
-          <w:p>
-            <w:pPr>
-              <w:spacing w:after="0" w:line="240" w:lineRule="auto"/>
-              <w:rPr>
-                <w:rFonts w:ascii="Calibri" w:eastAsia="Calibri" w:hAnsi="Calibri" w:cs="Calibri"/>
-                <w:sz w:val="24"/>
-                <w:szCs w:val="24"/>
-              </w:rPr>
-            </w:pPr>
-          </w:p>
-        </w:tc>
-        <w:tc>
-          <w:tcPr>
-            <w:tcW w:w="1575" w:type="dxa"/>
-            <w:tcBorders>
-              <w:top w:val="single" w:sz="4" w:space="0" w:color="000000"/>
-              <w:left w:val="single" w:sz="4" w:space="0" w:color="000000"/>
-              <w:bottom w:val="single" w:sz="4" w:space="0" w:color="000000"/>
-              <w:right w:val="single" w:sz="4" w:space="0" w:color="000000"/>
-            </w:tcBorders>
-            <w:tcMar>
-              <w:top w:w="0" w:type="dxa"/>
-              <w:left w:w="99" w:type="dxa"/>
-              <w:bottom w:w="0" w:type="dxa"/>
-              <w:right w:w="99" w:type="dxa"/>
-            </w:tcMar>
-            <w:vAlign w:val="center"/>
-          </w:tcPr>
-          <w:p>
-            <w:pPr>
-              <w:spacing w:after="0" w:line="240" w:lineRule="auto"/>
-              <w:rPr>
-                <w:rFonts w:ascii="Calibri" w:eastAsia="Calibri" w:hAnsi="Calibri" w:cs="Calibri"/>
-                <w:sz w:val="24"/>
-                <w:szCs w:val="24"/>
-              </w:rPr>
-            </w:pPr>
-          </w:p>
-        </w:tc>
-        <w:tc>
-          <w:tcPr>
-            <w:tcW w:w="2186" w:type="dxa"/>
-            <w:tcBorders>
-              <w:top w:val="single" w:sz="4" w:space="0" w:color="000000"/>
-              <w:left w:val="single" w:sz="4" w:space="0" w:color="000000"/>
-              <w:bottom w:val="single" w:sz="4" w:space="0" w:color="000000"/>
-              <w:right w:val="single" w:sz="4" w:space="0" w:color="000000"/>
-            </w:tcBorders>
-            <w:tcMar>
-              <w:top w:w="0" w:type="dxa"/>
-              <w:left w:w="99" w:type="dxa"/>
-              <w:bottom w:w="0" w:type="dxa"/>
-              <w:right w:w="99" w:type="dxa"/>
-            </w:tcMar>
-            <w:vAlign w:val="center"/>
-          </w:tcPr>
-          <w:p>
-            <w:pPr>
-              <w:spacing w:after="0" w:line="240" w:lineRule="auto"/>
-              <w:rPr>
-                <w:rFonts w:ascii="Calibri" w:eastAsia="Calibri" w:hAnsi="Calibri" w:cs="Calibri"/>
-                <w:sz w:val="24"/>
-                <w:szCs w:val="24"/>
-              </w:rPr>
-            </w:pPr>
-          </w:p>
-        </w:tc>
-      </w:tr>
     </w:tbl>
     <w:p>
       <w:pPr>
@@ -6828,6 +6863,98 @@
         </w:rPr>
         <w:br w:type="page"/>
       </w:r>
+    </w:p>
+    <w:p>
+      <w:pPr>
+        <w:spacing w:before="240" w:after="80" w:line="288" w:lineRule="auto"/>
+        <w:rPr>
+          <w:rFonts w:ascii="Times New Roman" w:hAnsi="Times New Roman"/>
+          <w:b/>
+          <w:color w:val="000000"/>
+          <w:sz w:val="24"/>
+          <w:lang w:val="vi-VN"/>
+        </w:rPr>
+      </w:pPr>
+      <w:r>
+        <w:rPr>
+          <w:rFonts w:ascii="Times New Roman" w:hAnsi="Times New Roman"/>
+          <w:b/>
+          <w:color w:val="000000"/>
+          <w:sz w:val="24"/>
+          <w:lang w:val="vi-VN"/>
+        </w:rPr>
+        <w:lastRenderedPageBreak/>
+        <w:t>Biểu đồ usecase tổng quan</w:t>
+      </w:r>
+    </w:p>
+    <w:p>
+      <w:pPr>
+        <w:spacing w:before="240" w:after="80" w:line="288" w:lineRule="auto"/>
+        <w:rPr>
+          <w:rFonts w:ascii="Times New Roman" w:hAnsi="Times New Roman"/>
+          <w:b/>
+          <w:color w:val="000000"/>
+          <w:sz w:val="24"/>
+          <w:lang w:val="vi-VN"/>
+        </w:rPr>
+      </w:pPr>
+      <w:r>
+        <w:rPr>
+          <w:rFonts w:ascii="Times New Roman" w:hAnsi="Times New Roman"/>
+          <w:b/>
+          <w:noProof/>
+          <w:color w:val="000000"/>
+          <w:sz w:val="24"/>
+          <w:lang w:val="vi-VN"/>
+        </w:rPr>
+        <w:drawing>
+          <wp:inline distT="0" distB="0" distL="0" distR="0" wp14:anchorId="7CDA2DB4" wp14:editId="04DF1C9C">
+            <wp:extent cx="6126480" cy="3562985"/>
+            <wp:effectExtent l="0" t="0" r="7620" b="0"/>
+            <wp:docPr id="913567528" name="Picture 2"/>
+            <wp:cNvGraphicFramePr>
+              <a:graphicFrameLocks xmlns:a="http://schemas.openxmlformats.org/drawingml/2006/main" noChangeAspect="1"/>
+            </wp:cNvGraphicFramePr>
+            <a:graphic xmlns:a="http://schemas.openxmlformats.org/drawingml/2006/main">
+              <a:graphicData uri="http://schemas.openxmlformats.org/drawingml/2006/picture">
+                <pic:pic xmlns:pic="http://schemas.openxmlformats.org/drawingml/2006/picture">
+                  <pic:nvPicPr>
+                    <pic:cNvPr id="913567528" name="Picture 913567528"/>
+                    <pic:cNvPicPr/>
+                  </pic:nvPicPr>
+                  <pic:blipFill>
+                    <a:blip r:embed="rId6"/>
+                    <a:stretch>
+                      <a:fillRect/>
+                    </a:stretch>
+                  </pic:blipFill>
+                  <pic:spPr>
+                    <a:xfrm>
+                      <a:off x="0" y="0"/>
+                      <a:ext cx="6126480" cy="3562985"/>
+                    </a:xfrm>
+                    <a:prstGeom prst="rect">
+                      <a:avLst/>
+                    </a:prstGeom>
+                  </pic:spPr>
+                </pic:pic>
+              </a:graphicData>
+            </a:graphic>
+          </wp:inline>
+        </w:drawing>
+      </w:r>
+    </w:p>
+    <w:p>
+      <w:pPr>
+        <w:spacing w:before="240" w:after="80" w:line="288" w:lineRule="auto"/>
+        <w:rPr>
+          <w:rFonts w:ascii="Times New Roman" w:hAnsi="Times New Roman"/>
+          <w:b/>
+          <w:color w:val="000000"/>
+          <w:sz w:val="24"/>
+          <w:lang w:val="vi-VN"/>
+        </w:rPr>
+      </w:pPr>
     </w:p>
     <w:p>
       <w:pPr>
@@ -6840,7 +6967,6 @@
           <w:color w:val="000000"/>
           <w:sz w:val="24"/>
         </w:rPr>
-        <w:lastRenderedPageBreak/>
         <w:t xml:space="preserve">Các </w:t>
       </w:r>
       <w:proofErr w:type="spellStart"/>
@@ -6901,13 +7027,38 @@
           <w:color w:val="000000"/>
           <w:sz w:val="24"/>
         </w:rPr>
-        <w:t xml:space="preserve"> ứng với từng actor:</w:t>
+        <w:t xml:space="preserve"> </w:t>
+      </w:r>
+      <w:proofErr w:type="spellStart"/>
+      <w:r>
+        <w:rPr>
+          <w:rFonts w:ascii="Times New Roman" w:hAnsi="Times New Roman"/>
+          <w:b/>
+          <w:color w:val="000000"/>
+          <w:sz w:val="24"/>
+        </w:rPr>
+        <w:t>ứng</w:t>
+      </w:r>
+      <w:proofErr w:type="spellEnd"/>
+      <w:r>
+        <w:rPr>
+          <w:rFonts w:ascii="Times New Roman" w:hAnsi="Times New Roman"/>
+          <w:b/>
+          <w:color w:val="000000"/>
+          <w:sz w:val="24"/>
+        </w:rPr>
+        <w:t xml:space="preserve"> với từng actor:</w:t>
       </w:r>
     </w:p>
     <w:p>
       <w:pPr>
         <w:spacing w:before="40" w:after="40" w:line="288" w:lineRule="auto"/>
         <w:ind w:left="288"/>
+        <w:rPr>
+          <w:rFonts w:ascii="Times New Roman" w:hAnsi="Times New Roman"/>
+          <w:color w:val="000000"/>
+          <w:lang w:val="vi-VN"/>
+        </w:rPr>
       </w:pPr>
       <w:r>
         <w:rPr>
@@ -6922,7 +7073,194 @@
           <w:rFonts w:ascii="Times New Roman" w:hAnsi="Times New Roman"/>
           <w:color w:val="000000"/>
         </w:rPr>
-        <w:t xml:space="preserve"> đăng nhập, đăng xuất, đổi mật khẩu, cập nhật thông tin cá nhân</w:t>
+        <w:t xml:space="preserve"> </w:t>
+      </w:r>
+    </w:p>
+    <w:p>
+      <w:pPr>
+        <w:pStyle w:val="ListParagraph"/>
+        <w:numPr>
+          <w:ilvl w:val="0"/>
+          <w:numId w:val="13"/>
+        </w:numPr>
+        <w:spacing w:before="40" w:after="40" w:line="288" w:lineRule="auto"/>
+        <w:rPr>
+          <w:rFonts w:ascii="Times New Roman" w:hAnsi="Times New Roman"/>
+          <w:color w:val="000000"/>
+          <w:lang w:val="vi-VN"/>
+        </w:rPr>
+      </w:pPr>
+      <w:proofErr w:type="spellStart"/>
+      <w:r>
+        <w:rPr>
+          <w:rFonts w:ascii="Times New Roman" w:hAnsi="Times New Roman"/>
+          <w:color w:val="000000"/>
+        </w:rPr>
+        <w:t>Đ</w:t>
+      </w:r>
+      <w:r>
+        <w:rPr>
+          <w:rFonts w:ascii="Times New Roman" w:hAnsi="Times New Roman"/>
+          <w:color w:val="000000"/>
+        </w:rPr>
+        <w:t>ăng</w:t>
+      </w:r>
+      <w:proofErr w:type="spellEnd"/>
+      <w:r>
+        <w:rPr>
+          <w:rFonts w:ascii="Times New Roman" w:hAnsi="Times New Roman"/>
+          <w:color w:val="000000"/>
+        </w:rPr>
+        <w:t xml:space="preserve"> </w:t>
+      </w:r>
+      <w:proofErr w:type="spellStart"/>
+      <w:r>
+        <w:rPr>
+          <w:rFonts w:ascii="Times New Roman" w:hAnsi="Times New Roman"/>
+          <w:color w:val="000000"/>
+        </w:rPr>
+        <w:t>nhập</w:t>
+      </w:r>
+      <w:proofErr w:type="spellEnd"/>
+      <w:r>
+        <w:rPr>
+          <w:rFonts w:ascii="Times New Roman" w:hAnsi="Times New Roman"/>
+          <w:color w:val="000000"/>
+        </w:rPr>
+        <w:t xml:space="preserve">, </w:t>
+      </w:r>
+      <w:proofErr w:type="spellStart"/>
+      <w:r>
+        <w:rPr>
+          <w:rFonts w:ascii="Times New Roman" w:hAnsi="Times New Roman"/>
+          <w:color w:val="000000"/>
+        </w:rPr>
+        <w:t>đăng</w:t>
+      </w:r>
+      <w:proofErr w:type="spellEnd"/>
+      <w:r>
+        <w:rPr>
+          <w:rFonts w:ascii="Times New Roman" w:hAnsi="Times New Roman"/>
+          <w:color w:val="000000"/>
+        </w:rPr>
+        <w:t xml:space="preserve"> </w:t>
+      </w:r>
+      <w:proofErr w:type="spellStart"/>
+      <w:r>
+        <w:rPr>
+          <w:rFonts w:ascii="Times New Roman" w:hAnsi="Times New Roman"/>
+          <w:color w:val="000000"/>
+        </w:rPr>
+        <w:t>xuất</w:t>
+      </w:r>
+      <w:proofErr w:type="spellEnd"/>
+      <w:r>
+        <w:rPr>
+          <w:rFonts w:ascii="Times New Roman" w:hAnsi="Times New Roman"/>
+          <w:color w:val="000000"/>
+        </w:rPr>
+        <w:t xml:space="preserve">, </w:t>
+      </w:r>
+      <w:proofErr w:type="spellStart"/>
+      <w:r>
+        <w:rPr>
+          <w:rFonts w:ascii="Times New Roman" w:hAnsi="Times New Roman"/>
+          <w:color w:val="000000"/>
+        </w:rPr>
+        <w:t>đổi</w:t>
+      </w:r>
+      <w:proofErr w:type="spellEnd"/>
+      <w:r>
+        <w:rPr>
+          <w:rFonts w:ascii="Times New Roman" w:hAnsi="Times New Roman"/>
+          <w:color w:val="000000"/>
+        </w:rPr>
+        <w:t xml:space="preserve"> mật khẩu, cập nhật </w:t>
+      </w:r>
+      <w:proofErr w:type="spellStart"/>
+      <w:r>
+        <w:rPr>
+          <w:rFonts w:ascii="Times New Roman" w:hAnsi="Times New Roman"/>
+          <w:color w:val="000000"/>
+        </w:rPr>
+        <w:t>thông</w:t>
+      </w:r>
+      <w:proofErr w:type="spellEnd"/>
+      <w:r>
+        <w:rPr>
+          <w:rFonts w:ascii="Times New Roman" w:hAnsi="Times New Roman"/>
+          <w:color w:val="000000"/>
+        </w:rPr>
+        <w:t xml:space="preserve"> tin </w:t>
+      </w:r>
+      <w:proofErr w:type="spellStart"/>
+      <w:r>
+        <w:rPr>
+          <w:rFonts w:ascii="Times New Roman" w:hAnsi="Times New Roman"/>
+          <w:color w:val="000000"/>
+        </w:rPr>
+        <w:t>cá</w:t>
+      </w:r>
+      <w:proofErr w:type="spellEnd"/>
+      <w:r>
+        <w:rPr>
+          <w:rFonts w:ascii="Times New Roman" w:hAnsi="Times New Roman"/>
+          <w:color w:val="000000"/>
+        </w:rPr>
+        <w:t xml:space="preserve"> </w:t>
+      </w:r>
+      <w:proofErr w:type="spellStart"/>
+      <w:r>
+        <w:rPr>
+          <w:rFonts w:ascii="Times New Roman" w:hAnsi="Times New Roman"/>
+          <w:color w:val="000000"/>
+        </w:rPr>
+        <w:t>nhân</w:t>
+      </w:r>
+      <w:proofErr w:type="spellEnd"/>
+    </w:p>
+    <w:p>
+      <w:pPr>
+        <w:pStyle w:val="ListParagraph"/>
+        <w:numPr>
+          <w:ilvl w:val="0"/>
+          <w:numId w:val="13"/>
+        </w:numPr>
+        <w:spacing w:before="40" w:after="40" w:line="288" w:lineRule="auto"/>
+        <w:rPr>
+          <w:rFonts w:ascii="Times New Roman" w:hAnsi="Times New Roman"/>
+          <w:color w:val="000000"/>
+          <w:lang w:val="vi-VN"/>
+        </w:rPr>
+      </w:pPr>
+      <w:r>
+        <w:rPr>
+          <w:rFonts w:ascii="Times New Roman" w:hAnsi="Times New Roman"/>
+          <w:color w:val="000000"/>
+          <w:lang w:val="vi-VN"/>
+        </w:rPr>
+        <w:t>Xem các bài đăng phòng trọ</w:t>
+      </w:r>
+    </w:p>
+    <w:p>
+      <w:pPr>
+        <w:pStyle w:val="ListParagraph"/>
+        <w:numPr>
+          <w:ilvl w:val="0"/>
+          <w:numId w:val="13"/>
+        </w:numPr>
+        <w:spacing w:before="40" w:after="40" w:line="288" w:lineRule="auto"/>
+        <w:rPr>
+          <w:lang w:val="vi-VN"/>
+        </w:rPr>
+      </w:pPr>
+      <w:r>
+        <w:rPr>
+          <w:rFonts w:ascii="Times New Roman" w:hAnsi="Times New Roman"/>
+          <w:color w:val="000000"/>
+          <w:lang w:val="vi-VN"/>
+        </w:rPr>
+        <w:t>Xem các bài viết tìm người ghép phòng</w:t>
       </w:r>
     </w:p>
     <w:p>
@@ -6941,7 +7279,43 @@
           <w:b/>
           <w:color w:val="000000"/>
         </w:rPr>
-        <w:t>Landlord (Chủ trọ):</w:t>
+        <w:t>Landlord (</w:t>
+      </w:r>
+      <w:proofErr w:type="spellStart"/>
+      <w:r>
+        <w:rPr>
+          <w:rFonts w:ascii="Times New Roman" w:hAnsi="Times New Roman"/>
+          <w:b/>
+          <w:color w:val="000000"/>
+        </w:rPr>
+        <w:t>Chủ</w:t>
+      </w:r>
+      <w:proofErr w:type="spellEnd"/>
+      <w:r>
+        <w:rPr>
+          <w:rFonts w:ascii="Times New Roman" w:hAnsi="Times New Roman"/>
+          <w:b/>
+          <w:color w:val="000000"/>
+        </w:rPr>
+        <w:t xml:space="preserve"> </w:t>
+      </w:r>
+      <w:proofErr w:type="spellStart"/>
+      <w:r>
+        <w:rPr>
+          <w:rFonts w:ascii="Times New Roman" w:hAnsi="Times New Roman"/>
+          <w:b/>
+          <w:color w:val="000000"/>
+        </w:rPr>
+        <w:t>trọ</w:t>
+      </w:r>
+      <w:proofErr w:type="spellEnd"/>
+      <w:r>
+        <w:rPr>
+          <w:rFonts w:ascii="Times New Roman" w:hAnsi="Times New Roman"/>
+          <w:b/>
+          <w:color w:val="000000"/>
+        </w:rPr>
+        <w:t>):</w:t>
       </w:r>
       <w:r>
         <w:rPr>
@@ -6965,13 +7339,20 @@
           <w:lang w:val="vi-VN"/>
         </w:rPr>
       </w:pPr>
+      <w:r>
+        <w:rPr>
+          <w:rFonts w:ascii="Times New Roman" w:hAnsi="Times New Roman"/>
+          <w:color w:val="000000"/>
+        </w:rPr>
+        <w:t xml:space="preserve">Quản </w:t>
+      </w:r>
       <w:proofErr w:type="spellStart"/>
       <w:r>
         <w:rPr>
           <w:rFonts w:ascii="Times New Roman" w:hAnsi="Times New Roman"/>
           <w:color w:val="000000"/>
         </w:rPr>
-        <w:t>Đăng</w:t>
+        <w:t>lý</w:t>
       </w:r>
       <w:proofErr w:type="spellEnd"/>
       <w:r>
@@ -6979,6 +7360,70 @@
           <w:rFonts w:ascii="Times New Roman" w:hAnsi="Times New Roman"/>
           <w:color w:val="000000"/>
         </w:rPr>
+        <w:t xml:space="preserve"> (</w:t>
+      </w:r>
+      <w:proofErr w:type="spellStart"/>
+      <w:r>
+        <w:rPr>
+          <w:rFonts w:ascii="Times New Roman" w:hAnsi="Times New Roman"/>
+          <w:color w:val="000000"/>
+        </w:rPr>
+        <w:t>thêm</w:t>
+      </w:r>
+      <w:proofErr w:type="spellEnd"/>
+      <w:r>
+        <w:rPr>
+          <w:rFonts w:ascii="Times New Roman" w:hAnsi="Times New Roman"/>
+          <w:color w:val="000000"/>
+        </w:rPr>
+        <w:t xml:space="preserve">, </w:t>
+      </w:r>
+      <w:proofErr w:type="spellStart"/>
+      <w:r>
+        <w:rPr>
+          <w:rFonts w:ascii="Times New Roman" w:hAnsi="Times New Roman"/>
+          <w:color w:val="000000"/>
+        </w:rPr>
+        <w:t>sửa</w:t>
+      </w:r>
+      <w:proofErr w:type="spellEnd"/>
+      <w:r>
+        <w:rPr>
+          <w:rFonts w:ascii="Times New Roman" w:hAnsi="Times New Roman"/>
+          <w:color w:val="000000"/>
+        </w:rPr>
+        <w:t xml:space="preserve">, </w:t>
+      </w:r>
+      <w:proofErr w:type="spellStart"/>
+      <w:r>
+        <w:rPr>
+          <w:rFonts w:ascii="Times New Roman" w:hAnsi="Times New Roman"/>
+          <w:color w:val="000000"/>
+        </w:rPr>
+        <w:t>xóa</w:t>
+      </w:r>
+      <w:proofErr w:type="spellEnd"/>
+      <w:r>
+        <w:rPr>
+          <w:rFonts w:ascii="Times New Roman" w:hAnsi="Times New Roman"/>
+          <w:color w:val="000000"/>
+        </w:rPr>
+        <w:t xml:space="preserve">) </w:t>
+      </w:r>
+      <w:proofErr w:type="spellStart"/>
+      <w:r>
+        <w:rPr>
+          <w:rFonts w:ascii="Times New Roman" w:hAnsi="Times New Roman"/>
+          <w:color w:val="000000"/>
+        </w:rPr>
+        <w:t>các</w:t>
+      </w:r>
+      <w:proofErr w:type="spellEnd"/>
+      <w:r>
+        <w:rPr>
+          <w:rFonts w:ascii="Times New Roman" w:hAnsi="Times New Roman"/>
+          <w:color w:val="000000"/>
+        </w:rPr>
         <w:t xml:space="preserve"> </w:t>
       </w:r>
       <w:proofErr w:type="spellStart"/>
@@ -6987,14 +7432,7 @@
           <w:rFonts w:ascii="Times New Roman" w:hAnsi="Times New Roman"/>
           <w:color w:val="000000"/>
         </w:rPr>
-        <w:t>nh</w:t>
-      </w:r>
-      <w:r>
-        <w:rPr>
-          <w:rFonts w:ascii="Times New Roman" w:hAnsi="Times New Roman"/>
-          <w:color w:val="000000"/>
-        </w:rPr>
-        <w:t>ập</w:t>
+        <w:t>thông</w:t>
       </w:r>
       <w:proofErr w:type="spellEnd"/>
       <w:r>
@@ -7002,7 +7440,7 @@
           <w:rFonts w:ascii="Times New Roman" w:hAnsi="Times New Roman"/>
           <w:color w:val="000000"/>
         </w:rPr>
-        <w:t xml:space="preserve">, </w:t>
+        <w:t xml:space="preserve"> tin </w:t>
       </w:r>
       <w:proofErr w:type="spellStart"/>
       <w:r>
@@ -7010,7 +7448,7 @@
           <w:rFonts w:ascii="Times New Roman" w:hAnsi="Times New Roman"/>
           <w:color w:val="000000"/>
         </w:rPr>
-        <w:t>đăng</w:t>
+        <w:t>tòa</w:t>
       </w:r>
       <w:proofErr w:type="spellEnd"/>
       <w:r>
@@ -7026,135 +7464,7 @@
           <w:rFonts w:ascii="Times New Roman" w:hAnsi="Times New Roman"/>
           <w:color w:val="000000"/>
         </w:rPr>
-        <w:t>xuất</w:t>
-      </w:r>
-      <w:proofErr w:type="spellEnd"/>
-      <w:r>
-        <w:rPr>
-          <w:rFonts w:ascii="Times New Roman" w:hAnsi="Times New Roman"/>
-          <w:color w:val="000000"/>
-        </w:rPr>
-        <w:t xml:space="preserve">, </w:t>
-      </w:r>
-      <w:proofErr w:type="spellStart"/>
-      <w:r>
-        <w:rPr>
-          <w:rFonts w:ascii="Times New Roman" w:hAnsi="Times New Roman"/>
-          <w:color w:val="000000"/>
-        </w:rPr>
-        <w:t>đổi</w:t>
-      </w:r>
-      <w:proofErr w:type="spellEnd"/>
-      <w:r>
-        <w:rPr>
-          <w:rFonts w:ascii="Times New Roman" w:hAnsi="Times New Roman"/>
-          <w:color w:val="000000"/>
-        </w:rPr>
-        <w:t xml:space="preserve"> </w:t>
-      </w:r>
-      <w:proofErr w:type="spellStart"/>
-      <w:r>
-        <w:rPr>
-          <w:rFonts w:ascii="Times New Roman" w:hAnsi="Times New Roman"/>
-          <w:color w:val="000000"/>
-        </w:rPr>
-        <w:t>mật</w:t>
-      </w:r>
-      <w:proofErr w:type="spellEnd"/>
-      <w:r>
-        <w:rPr>
-          <w:rFonts w:ascii="Times New Roman" w:hAnsi="Times New Roman"/>
-          <w:color w:val="000000"/>
-        </w:rPr>
-        <w:t xml:space="preserve"> </w:t>
-      </w:r>
-      <w:proofErr w:type="spellStart"/>
-      <w:r>
-        <w:rPr>
-          <w:rFonts w:ascii="Times New Roman" w:hAnsi="Times New Roman"/>
-          <w:color w:val="000000"/>
-        </w:rPr>
-        <w:t>khẩu</w:t>
-      </w:r>
-      <w:proofErr w:type="spellEnd"/>
-      <w:r>
-        <w:rPr>
-          <w:rFonts w:ascii="Times New Roman" w:hAnsi="Times New Roman"/>
-          <w:color w:val="000000"/>
-        </w:rPr>
-        <w:t xml:space="preserve">, </w:t>
-      </w:r>
-      <w:proofErr w:type="spellStart"/>
-      <w:r>
-        <w:rPr>
-          <w:rFonts w:ascii="Times New Roman" w:hAnsi="Times New Roman"/>
-          <w:color w:val="000000"/>
-        </w:rPr>
-        <w:t>cập</w:t>
-      </w:r>
-      <w:proofErr w:type="spellEnd"/>
-      <w:r>
-        <w:rPr>
-          <w:rFonts w:ascii="Times New Roman" w:hAnsi="Times New Roman"/>
-          <w:color w:val="000000"/>
-        </w:rPr>
-        <w:t xml:space="preserve"> </w:t>
-      </w:r>
-      <w:proofErr w:type="spellStart"/>
-      <w:r>
-        <w:rPr>
-          <w:rFonts w:ascii="Times New Roman" w:hAnsi="Times New Roman"/>
-          <w:color w:val="000000"/>
-        </w:rPr>
-        <w:t>nhật</w:t>
-      </w:r>
-      <w:proofErr w:type="spellEnd"/>
-      <w:r>
-        <w:rPr>
-          <w:rFonts w:ascii="Times New Roman" w:hAnsi="Times New Roman"/>
-          <w:color w:val="000000"/>
-        </w:rPr>
-        <w:t xml:space="preserve"> </w:t>
-      </w:r>
-      <w:proofErr w:type="spellStart"/>
-      <w:r>
-        <w:rPr>
-          <w:rFonts w:ascii="Times New Roman" w:hAnsi="Times New Roman"/>
-          <w:color w:val="000000"/>
-        </w:rPr>
-        <w:t>thông</w:t>
-      </w:r>
-      <w:proofErr w:type="spellEnd"/>
-      <w:r>
-        <w:rPr>
-          <w:rFonts w:ascii="Times New Roman" w:hAnsi="Times New Roman"/>
-          <w:color w:val="000000"/>
-        </w:rPr>
-        <w:t xml:space="preserve"> tin </w:t>
-      </w:r>
-      <w:proofErr w:type="spellStart"/>
-      <w:r>
-        <w:rPr>
-          <w:rFonts w:ascii="Times New Roman" w:hAnsi="Times New Roman"/>
-          <w:color w:val="000000"/>
-        </w:rPr>
-        <w:t>cá</w:t>
-      </w:r>
-      <w:proofErr w:type="spellEnd"/>
-      <w:r>
-        <w:rPr>
-          <w:rFonts w:ascii="Times New Roman" w:hAnsi="Times New Roman"/>
-          <w:color w:val="000000"/>
-        </w:rPr>
-        <w:t xml:space="preserve"> </w:t>
-      </w:r>
-      <w:proofErr w:type="spellStart"/>
-      <w:r>
-        <w:rPr>
-          <w:rFonts w:ascii="Times New Roman" w:hAnsi="Times New Roman"/>
-          <w:color w:val="000000"/>
-        </w:rPr>
-        <w:t>nhân</w:t>
+        <w:t>nhà</w:t>
       </w:r>
       <w:proofErr w:type="spellEnd"/>
       <w:r>
@@ -7264,7 +7574,7 @@
           <w:rFonts w:ascii="Times New Roman" w:hAnsi="Times New Roman"/>
           <w:color w:val="000000"/>
         </w:rPr>
-        <w:t xml:space="preserve"> thông tin </w:t>
+        <w:t xml:space="preserve"> </w:t>
       </w:r>
       <w:proofErr w:type="spellStart"/>
       <w:r>
@@ -7272,7 +7582,7 @@
           <w:rFonts w:ascii="Times New Roman" w:hAnsi="Times New Roman"/>
           <w:color w:val="000000"/>
         </w:rPr>
-        <w:t>tòa</w:t>
+        <w:t>thông</w:t>
       </w:r>
       <w:proofErr w:type="spellEnd"/>
       <w:r>
@@ -7280,6 +7590,22 @@
           <w:rFonts w:ascii="Times New Roman" w:hAnsi="Times New Roman"/>
           <w:color w:val="000000"/>
         </w:rPr>
+        <w:t xml:space="preserve"> tin </w:t>
+      </w:r>
+      <w:proofErr w:type="spellStart"/>
+      <w:r>
+        <w:rPr>
+          <w:rFonts w:ascii="Times New Roman" w:hAnsi="Times New Roman"/>
+          <w:color w:val="000000"/>
+        </w:rPr>
+        <w:t>phòng</w:t>
+      </w:r>
+      <w:proofErr w:type="spellEnd"/>
+      <w:r>
+        <w:rPr>
+          <w:rFonts w:ascii="Times New Roman" w:hAnsi="Times New Roman"/>
+          <w:color w:val="000000"/>
+        </w:rPr>
         <w:t xml:space="preserve"> </w:t>
       </w:r>
       <w:proofErr w:type="spellStart"/>
@@ -7288,7 +7614,7 @@
           <w:rFonts w:ascii="Times New Roman" w:hAnsi="Times New Roman"/>
           <w:color w:val="000000"/>
         </w:rPr>
-        <w:t>nhà</w:t>
+        <w:t>trọ</w:t>
       </w:r>
       <w:proofErr w:type="spellEnd"/>
       <w:r>
@@ -7398,7 +7724,7 @@
           <w:rFonts w:ascii="Times New Roman" w:hAnsi="Times New Roman"/>
           <w:color w:val="000000"/>
         </w:rPr>
-        <w:t xml:space="preserve"> thông tin </w:t>
+        <w:t xml:space="preserve"> </w:t>
       </w:r>
       <w:proofErr w:type="spellStart"/>
       <w:r>
@@ -7406,7 +7732,7 @@
           <w:rFonts w:ascii="Times New Roman" w:hAnsi="Times New Roman"/>
           <w:color w:val="000000"/>
         </w:rPr>
-        <w:t>phòng</w:t>
+        <w:t>dịch</w:t>
       </w:r>
       <w:proofErr w:type="spellEnd"/>
       <w:r>
@@ -7422,7 +7748,39 @@
           <w:rFonts w:ascii="Times New Roman" w:hAnsi="Times New Roman"/>
           <w:color w:val="000000"/>
         </w:rPr>
-        <w:t>trọ</w:t>
+        <w:t>vụ</w:t>
+      </w:r>
+      <w:proofErr w:type="spellEnd"/>
+      <w:r>
+        <w:rPr>
+          <w:rFonts w:ascii="Times New Roman" w:hAnsi="Times New Roman"/>
+          <w:color w:val="000000"/>
+        </w:rPr>
+        <w:t xml:space="preserve"> </w:t>
+      </w:r>
+      <w:proofErr w:type="spellStart"/>
+      <w:r>
+        <w:rPr>
+          <w:rFonts w:ascii="Times New Roman" w:hAnsi="Times New Roman"/>
+          <w:color w:val="000000"/>
+        </w:rPr>
+        <w:t>tiện</w:t>
+      </w:r>
+      <w:proofErr w:type="spellEnd"/>
+      <w:r>
+        <w:rPr>
+          <w:rFonts w:ascii="Times New Roman" w:hAnsi="Times New Roman"/>
+          <w:color w:val="000000"/>
+        </w:rPr>
+        <w:t xml:space="preserve"> </w:t>
+      </w:r>
+      <w:proofErr w:type="spellStart"/>
+      <w:r>
+        <w:rPr>
+          <w:rFonts w:ascii="Times New Roman" w:hAnsi="Times New Roman"/>
+          <w:color w:val="000000"/>
+        </w:rPr>
+        <w:t>ích</w:t>
       </w:r>
       <w:proofErr w:type="spellEnd"/>
       <w:r>
@@ -7516,7 +7874,7 @@
           <w:rFonts w:ascii="Times New Roman" w:hAnsi="Times New Roman"/>
           <w:color w:val="000000"/>
         </w:rPr>
-        <w:t xml:space="preserve">) </w:t>
+        <w:t xml:space="preserve">, </w:t>
       </w:r>
       <w:proofErr w:type="spellStart"/>
       <w:r>
@@ -7524,7 +7882,7 @@
           <w:rFonts w:ascii="Times New Roman" w:hAnsi="Times New Roman"/>
           <w:color w:val="000000"/>
         </w:rPr>
-        <w:t>các</w:t>
+        <w:t>mời</w:t>
       </w:r>
       <w:proofErr w:type="spellEnd"/>
       <w:r>
@@ -7532,7 +7890,7 @@
           <w:rFonts w:ascii="Times New Roman" w:hAnsi="Times New Roman"/>
           <w:color w:val="000000"/>
         </w:rPr>
-        <w:t xml:space="preserve"> dịch </w:t>
+        <w:t xml:space="preserve"> </w:t>
       </w:r>
       <w:proofErr w:type="spellStart"/>
       <w:r>
@@ -7540,7 +7898,7 @@
           <w:rFonts w:ascii="Times New Roman" w:hAnsi="Times New Roman"/>
           <w:color w:val="000000"/>
         </w:rPr>
-        <w:t>vụ</w:t>
+        <w:t>liên</w:t>
       </w:r>
       <w:proofErr w:type="spellEnd"/>
       <w:r>
@@ -7556,7 +7914,7 @@
           <w:rFonts w:ascii="Times New Roman" w:hAnsi="Times New Roman"/>
           <w:color w:val="000000"/>
         </w:rPr>
-        <w:t>tiện</w:t>
+        <w:t>kết</w:t>
       </w:r>
       <w:proofErr w:type="spellEnd"/>
       <w:r>
@@ -7572,7 +7930,7 @@
           <w:rFonts w:ascii="Times New Roman" w:hAnsi="Times New Roman"/>
           <w:color w:val="000000"/>
         </w:rPr>
-        <w:t>ích</w:t>
+        <w:t>tài</w:t>
       </w:r>
       <w:proofErr w:type="spellEnd"/>
       <w:r>
@@ -7580,7 +7938,7 @@
           <w:rFonts w:ascii="Times New Roman" w:hAnsi="Times New Roman"/>
           <w:color w:val="000000"/>
         </w:rPr>
-        <w:t xml:space="preserve">, </w:t>
+        <w:t xml:space="preserve"> khoản) thông tin khách thuê, </w:t>
       </w:r>
     </w:p>
     <w:p>
@@ -7602,7 +7960,15 @@
           <w:rFonts w:ascii="Times New Roman" w:hAnsi="Times New Roman"/>
           <w:color w:val="000000"/>
         </w:rPr>
-        <w:t xml:space="preserve">Quản </w:t>
+        <w:t>Quản</w:t>
+      </w:r>
+      <w:r>
+        <w:rPr>
+          <w:rFonts w:ascii="Times New Roman" w:hAnsi="Times New Roman"/>
+          <w:color w:val="000000"/>
+          <w:lang w:val="vi-VN"/>
+        </w:rPr>
+        <w:t xml:space="preserve"> </w:t>
       </w:r>
       <w:proofErr w:type="spellStart"/>
       <w:r>
@@ -7618,7 +7984,7 @@
           <w:rFonts w:ascii="Times New Roman" w:hAnsi="Times New Roman"/>
           <w:color w:val="000000"/>
         </w:rPr>
-        <w:t xml:space="preserve"> (</w:t>
+        <w:t xml:space="preserve"> </w:t>
       </w:r>
       <w:proofErr w:type="spellStart"/>
       <w:r>
@@ -7626,7 +7992,7 @@
           <w:rFonts w:ascii="Times New Roman" w:hAnsi="Times New Roman"/>
           <w:color w:val="000000"/>
         </w:rPr>
-        <w:t>thêm</w:t>
+        <w:t>hợp</w:t>
       </w:r>
       <w:proofErr w:type="spellEnd"/>
       <w:r>
@@ -7634,55 +8000,63 @@
           <w:rFonts w:ascii="Times New Roman" w:hAnsi="Times New Roman"/>
           <w:color w:val="000000"/>
         </w:rPr>
+        <w:t xml:space="preserve"> </w:t>
+      </w:r>
+      <w:proofErr w:type="spellStart"/>
+      <w:r>
+        <w:rPr>
+          <w:rFonts w:ascii="Times New Roman" w:hAnsi="Times New Roman"/>
+          <w:color w:val="000000"/>
+        </w:rPr>
+        <w:t>đồng</w:t>
+      </w:r>
+      <w:proofErr w:type="spellEnd"/>
+      <w:r>
+        <w:rPr>
+          <w:rFonts w:ascii="Times New Roman" w:hAnsi="Times New Roman"/>
+          <w:color w:val="000000"/>
+        </w:rPr>
+        <w:t xml:space="preserve"> </w:t>
+      </w:r>
+      <w:proofErr w:type="spellStart"/>
+      <w:r>
+        <w:rPr>
+          <w:rFonts w:ascii="Times New Roman" w:hAnsi="Times New Roman"/>
+          <w:color w:val="000000"/>
+        </w:rPr>
+        <w:t>thuê</w:t>
+      </w:r>
+      <w:proofErr w:type="spellEnd"/>
+      <w:r>
+        <w:rPr>
+          <w:rFonts w:ascii="Times New Roman" w:hAnsi="Times New Roman"/>
+          <w:color w:val="000000"/>
+        </w:rPr>
+        <w:t xml:space="preserve"> </w:t>
+      </w:r>
+      <w:proofErr w:type="spellStart"/>
+      <w:r>
+        <w:rPr>
+          <w:rFonts w:ascii="Times New Roman" w:hAnsi="Times New Roman"/>
+          <w:color w:val="000000"/>
+        </w:rPr>
+        <w:t>phòng</w:t>
+      </w:r>
+      <w:proofErr w:type="spellEnd"/>
+      <w:r>
+        <w:rPr>
+          <w:rFonts w:ascii="Times New Roman" w:hAnsi="Times New Roman"/>
+          <w:color w:val="000000"/>
+          <w:lang w:val="vi-VN"/>
+        </w:rPr>
+        <w:t xml:space="preserve"> (tạo, xóa hợp đồng)</w:t>
+      </w:r>
+      <w:r>
+        <w:rPr>
+          <w:rFonts w:ascii="Times New Roman" w:hAnsi="Times New Roman"/>
+          <w:color w:val="000000"/>
+        </w:rPr>
         <w:t xml:space="preserve">, </w:t>
-      </w:r>
-      <w:proofErr w:type="spellStart"/>
-      <w:r>
-        <w:rPr>
-          <w:rFonts w:ascii="Times New Roman" w:hAnsi="Times New Roman"/>
-          <w:color w:val="000000"/>
-        </w:rPr>
-        <w:t>sửa</w:t>
-      </w:r>
-      <w:proofErr w:type="spellEnd"/>
-      <w:r>
-        <w:rPr>
-          <w:rFonts w:ascii="Times New Roman" w:hAnsi="Times New Roman"/>
-          <w:color w:val="000000"/>
-        </w:rPr>
-        <w:t xml:space="preserve">, </w:t>
-      </w:r>
-      <w:proofErr w:type="spellStart"/>
-      <w:r>
-        <w:rPr>
-          <w:rFonts w:ascii="Times New Roman" w:hAnsi="Times New Roman"/>
-          <w:color w:val="000000"/>
-        </w:rPr>
-        <w:t>xóa</w:t>
-      </w:r>
-      <w:proofErr w:type="spellEnd"/>
-      <w:r>
-        <w:rPr>
-          <w:rFonts w:ascii="Times New Roman" w:hAnsi="Times New Roman"/>
-          <w:color w:val="000000"/>
-        </w:rPr>
-        <w:t xml:space="preserve">, </w:t>
-      </w:r>
-      <w:proofErr w:type="spellStart"/>
-      <w:r>
-        <w:rPr>
-          <w:rFonts w:ascii="Times New Roman" w:hAnsi="Times New Roman"/>
-          <w:color w:val="000000"/>
-        </w:rPr>
-        <w:t>mời</w:t>
-      </w:r>
-      <w:proofErr w:type="spellEnd"/>
-      <w:r>
-        <w:rPr>
-          <w:rFonts w:ascii="Times New Roman" w:hAnsi="Times New Roman"/>
-          <w:color w:val="000000"/>
-        </w:rPr>
-        <w:t xml:space="preserve"> liên kết tài khoản) thông tin khách thuê, </w:t>
       </w:r>
     </w:p>
     <w:p>
@@ -7699,20 +8073,35 @@
           <w:lang w:val="vi-VN"/>
         </w:rPr>
       </w:pPr>
+      <w:r>
+        <w:rPr>
+          <w:rFonts w:ascii="Times New Roman" w:hAnsi="Times New Roman"/>
+          <w:color w:val="000000"/>
+        </w:rPr>
+        <w:t>Quản</w:t>
+      </w:r>
+      <w:r>
+        <w:rPr>
+          <w:rFonts w:ascii="Times New Roman" w:hAnsi="Times New Roman"/>
+          <w:color w:val="000000"/>
+          <w:lang w:val="vi-VN"/>
+        </w:rPr>
+        <w:t xml:space="preserve"> lý hóa đơn</w:t>
+      </w:r>
+      <w:r>
+        <w:rPr>
+          <w:rFonts w:ascii="Times New Roman" w:hAnsi="Times New Roman"/>
+          <w:color w:val="000000"/>
+        </w:rPr>
+        <w:t xml:space="preserve"> (</w:t>
+      </w:r>
       <w:proofErr w:type="spellStart"/>
       <w:r>
         <w:rPr>
           <w:rFonts w:ascii="Times New Roman" w:hAnsi="Times New Roman"/>
           <w:color w:val="000000"/>
         </w:rPr>
-        <w:t>T</w:t>
-      </w:r>
-      <w:r>
-        <w:rPr>
-          <w:rFonts w:ascii="Times New Roman" w:hAnsi="Times New Roman"/>
-          <w:color w:val="000000"/>
-        </w:rPr>
-        <w:t>ạo</w:t>
+        <w:t>lập</w:t>
       </w:r>
       <w:proofErr w:type="spellEnd"/>
       <w:r>
@@ -7728,7 +8117,7 @@
           <w:rFonts w:ascii="Times New Roman" w:hAnsi="Times New Roman"/>
           <w:color w:val="000000"/>
         </w:rPr>
-        <w:t>và</w:t>
+        <w:t>hóa</w:t>
       </w:r>
       <w:proofErr w:type="spellEnd"/>
       <w:r>
@@ -7744,6 +8133,118 @@
           <w:rFonts w:ascii="Times New Roman" w:hAnsi="Times New Roman"/>
           <w:color w:val="000000"/>
         </w:rPr>
+        <w:t>đơn</w:t>
+      </w:r>
+      <w:proofErr w:type="spellEnd"/>
+      <w:r>
+        <w:rPr>
+          <w:rFonts w:ascii="Times New Roman" w:hAnsi="Times New Roman"/>
+          <w:color w:val="000000"/>
+        </w:rPr>
+        <w:t xml:space="preserve">, </w:t>
+      </w:r>
+      <w:proofErr w:type="spellStart"/>
+      <w:r>
+        <w:rPr>
+          <w:rFonts w:ascii="Times New Roman" w:hAnsi="Times New Roman"/>
+          <w:color w:val="000000"/>
+        </w:rPr>
+        <w:t>điều</w:t>
+      </w:r>
+      <w:proofErr w:type="spellEnd"/>
+      <w:r>
+        <w:rPr>
+          <w:rFonts w:ascii="Times New Roman" w:hAnsi="Times New Roman"/>
+          <w:color w:val="000000"/>
+        </w:rPr>
+        <w:t xml:space="preserve"> </w:t>
+      </w:r>
+      <w:proofErr w:type="spellStart"/>
+      <w:r>
+        <w:rPr>
+          <w:rFonts w:ascii="Times New Roman" w:hAnsi="Times New Roman"/>
+          <w:color w:val="000000"/>
+        </w:rPr>
+        <w:t>chỉnh</w:t>
+      </w:r>
+      <w:proofErr w:type="spellEnd"/>
+      <w:r>
+        <w:rPr>
+          <w:rFonts w:ascii="Times New Roman" w:hAnsi="Times New Roman"/>
+          <w:color w:val="000000"/>
+        </w:rPr>
+        <w:t xml:space="preserve"> </w:t>
+      </w:r>
+      <w:proofErr w:type="spellStart"/>
+      <w:r>
+        <w:rPr>
+          <w:rFonts w:ascii="Times New Roman" w:hAnsi="Times New Roman"/>
+          <w:color w:val="000000"/>
+        </w:rPr>
+        <w:t>hóa</w:t>
+      </w:r>
+      <w:proofErr w:type="spellEnd"/>
+      <w:r>
+        <w:rPr>
+          <w:rFonts w:ascii="Times New Roman" w:hAnsi="Times New Roman"/>
+          <w:color w:val="000000"/>
+        </w:rPr>
+        <w:t xml:space="preserve"> </w:t>
+      </w:r>
+      <w:proofErr w:type="spellStart"/>
+      <w:r>
+        <w:rPr>
+          <w:rFonts w:ascii="Times New Roman" w:hAnsi="Times New Roman"/>
+          <w:color w:val="000000"/>
+        </w:rPr>
+        <w:t>đơn</w:t>
+      </w:r>
+      <w:proofErr w:type="spellEnd"/>
+      <w:r>
+        <w:rPr>
+          <w:rFonts w:ascii="Times New Roman" w:hAnsi="Times New Roman"/>
+          <w:color w:val="000000"/>
+        </w:rPr>
+        <w:t xml:space="preserve">, </w:t>
+      </w:r>
+      <w:proofErr w:type="spellStart"/>
+      <w:r>
+        <w:rPr>
+          <w:rFonts w:ascii="Times New Roman" w:hAnsi="Times New Roman"/>
+          <w:color w:val="000000"/>
+        </w:rPr>
+        <w:t>xác</w:t>
+      </w:r>
+      <w:proofErr w:type="spellEnd"/>
+      <w:r>
+        <w:rPr>
+          <w:rFonts w:ascii="Times New Roman" w:hAnsi="Times New Roman"/>
+          <w:color w:val="000000"/>
+        </w:rPr>
+        <w:t xml:space="preserve"> </w:t>
+      </w:r>
+      <w:proofErr w:type="spellStart"/>
+      <w:r>
+        <w:rPr>
+          <w:rFonts w:ascii="Times New Roman" w:hAnsi="Times New Roman"/>
+          <w:color w:val="000000"/>
+        </w:rPr>
+        <w:t>nhận</w:t>
+      </w:r>
+      <w:proofErr w:type="spellEnd"/>
+      <w:r>
+        <w:rPr>
+          <w:rFonts w:ascii="Times New Roman" w:hAnsi="Times New Roman"/>
+          <w:color w:val="000000"/>
+        </w:rPr>
+        <w:t xml:space="preserve"> </w:t>
+      </w:r>
+      <w:proofErr w:type="spellStart"/>
+      <w:r>
+        <w:rPr>
+          <w:rFonts w:ascii="Times New Roman" w:hAnsi="Times New Roman"/>
+          <w:color w:val="000000"/>
+        </w:rPr>
         <w:t>thanh</w:t>
       </w:r>
       <w:proofErr w:type="spellEnd"/>
@@ -7760,7 +8261,7 @@
           <w:rFonts w:ascii="Times New Roman" w:hAnsi="Times New Roman"/>
           <w:color w:val="000000"/>
         </w:rPr>
-        <w:t>lý</w:t>
+        <w:t>toán</w:t>
       </w:r>
       <w:proofErr w:type="spellEnd"/>
       <w:r>
@@ -7768,7 +8269,7 @@
           <w:rFonts w:ascii="Times New Roman" w:hAnsi="Times New Roman"/>
           <w:color w:val="000000"/>
         </w:rPr>
-        <w:t xml:space="preserve"> hợp đồng thuê phòng, </w:t>
+        <w:t xml:space="preserve">), </w:t>
       </w:r>
     </w:p>
     <w:p>
@@ -7785,178 +8286,13 @@
           <w:lang w:val="vi-VN"/>
         </w:rPr>
       </w:pPr>
-      <w:proofErr w:type="spellStart"/>
-      <w:r>
-        <w:rPr>
-          <w:rFonts w:ascii="Times New Roman" w:hAnsi="Times New Roman"/>
-          <w:color w:val="000000"/>
-        </w:rPr>
-        <w:t>Tính</w:t>
-      </w:r>
-      <w:proofErr w:type="spellEnd"/>
-      <w:r>
-        <w:rPr>
-          <w:rFonts w:ascii="Times New Roman" w:hAnsi="Times New Roman"/>
-          <w:color w:val="000000"/>
-        </w:rPr>
-        <w:t xml:space="preserve"> </w:t>
-      </w:r>
-      <w:proofErr w:type="spellStart"/>
-      <w:r>
-        <w:rPr>
-          <w:rFonts w:ascii="Times New Roman" w:hAnsi="Times New Roman"/>
-          <w:color w:val="000000"/>
-        </w:rPr>
-        <w:t>ti</w:t>
-      </w:r>
-      <w:r>
-        <w:rPr>
-          <w:rFonts w:ascii="Times New Roman" w:hAnsi="Times New Roman"/>
-          <w:color w:val="000000"/>
-        </w:rPr>
-        <w:t>ền</w:t>
-      </w:r>
-      <w:proofErr w:type="spellEnd"/>
-      <w:r>
-        <w:rPr>
-          <w:rFonts w:ascii="Times New Roman" w:hAnsi="Times New Roman"/>
-          <w:color w:val="000000"/>
-        </w:rPr>
-        <w:t xml:space="preserve"> </w:t>
-      </w:r>
-      <w:proofErr w:type="spellStart"/>
-      <w:r>
-        <w:rPr>
-          <w:rFonts w:ascii="Times New Roman" w:hAnsi="Times New Roman"/>
-          <w:color w:val="000000"/>
-        </w:rPr>
-        <w:t>phòng</w:t>
-      </w:r>
-      <w:proofErr w:type="spellEnd"/>
-      <w:r>
-        <w:rPr>
-          <w:rFonts w:ascii="Times New Roman" w:hAnsi="Times New Roman"/>
-          <w:color w:val="000000"/>
-        </w:rPr>
-        <w:t xml:space="preserve"> </w:t>
-      </w:r>
-      <w:proofErr w:type="spellStart"/>
-      <w:r>
-        <w:rPr>
-          <w:rFonts w:ascii="Times New Roman" w:hAnsi="Times New Roman"/>
-          <w:color w:val="000000"/>
-        </w:rPr>
-        <w:t>theo</w:t>
-      </w:r>
-      <w:proofErr w:type="spellEnd"/>
-      <w:r>
-        <w:rPr>
-          <w:rFonts w:ascii="Times New Roman" w:hAnsi="Times New Roman"/>
-          <w:color w:val="000000"/>
-        </w:rPr>
-        <w:t xml:space="preserve"> </w:t>
-      </w:r>
-      <w:proofErr w:type="spellStart"/>
-      <w:r>
-        <w:rPr>
-          <w:rFonts w:ascii="Times New Roman" w:hAnsi="Times New Roman"/>
-          <w:color w:val="000000"/>
-        </w:rPr>
-        <w:t>tháng</w:t>
-      </w:r>
-      <w:proofErr w:type="spellEnd"/>
-      <w:r>
-        <w:rPr>
-          <w:rFonts w:ascii="Times New Roman" w:hAnsi="Times New Roman"/>
-          <w:color w:val="000000"/>
-        </w:rPr>
-        <w:t xml:space="preserve"> (lập hóa đơn, điều chỉnh hóa đơn, xác nhận thanh toán), </w:t>
-      </w:r>
-    </w:p>
-    <w:p>
-      <w:pPr>
-        <w:pStyle w:val="ListParagraph"/>
-        <w:numPr>
-          <w:ilvl w:val="0"/>
-          <w:numId w:val="10"/>
-        </w:numPr>
-        <w:spacing w:before="40" w:after="40" w:line="288" w:lineRule="auto"/>
+      <w:r>
         <w:rPr>
           <w:rFonts w:ascii="Times New Roman" w:hAnsi="Times New Roman"/>
           <w:color w:val="000000"/>
           <w:lang w:val="vi-VN"/>
         </w:rPr>
-      </w:pPr>
-      <w:proofErr w:type="spellStart"/>
-      <w:r>
-        <w:rPr>
-          <w:rFonts w:ascii="Times New Roman" w:hAnsi="Times New Roman"/>
-          <w:color w:val="000000"/>
-        </w:rPr>
-        <w:t>Ti</w:t>
-      </w:r>
-      <w:r>
-        <w:rPr>
-          <w:rFonts w:ascii="Times New Roman" w:hAnsi="Times New Roman"/>
-          <w:color w:val="000000"/>
-        </w:rPr>
-        <w:t>ếp</w:t>
-      </w:r>
-      <w:proofErr w:type="spellEnd"/>
-      <w:r>
-        <w:rPr>
-          <w:rFonts w:ascii="Times New Roman" w:hAnsi="Times New Roman"/>
-          <w:color w:val="000000"/>
-        </w:rPr>
-        <w:t xml:space="preserve"> </w:t>
-      </w:r>
-      <w:proofErr w:type="spellStart"/>
-      <w:r>
-        <w:rPr>
-          <w:rFonts w:ascii="Times New Roman" w:hAnsi="Times New Roman"/>
-          <w:color w:val="000000"/>
-        </w:rPr>
-        <w:t>nhận</w:t>
-      </w:r>
-      <w:proofErr w:type="spellEnd"/>
-      <w:r>
-        <w:rPr>
-          <w:rFonts w:ascii="Times New Roman" w:hAnsi="Times New Roman"/>
-          <w:color w:val="000000"/>
-        </w:rPr>
-        <w:t xml:space="preserve"> </w:t>
-      </w:r>
-      <w:proofErr w:type="spellStart"/>
-      <w:r>
-        <w:rPr>
-          <w:rFonts w:ascii="Times New Roman" w:hAnsi="Times New Roman"/>
-          <w:color w:val="000000"/>
-        </w:rPr>
-        <w:t>và</w:t>
-      </w:r>
-      <w:proofErr w:type="spellEnd"/>
-      <w:r>
-        <w:rPr>
-          <w:rFonts w:ascii="Times New Roman" w:hAnsi="Times New Roman"/>
-          <w:color w:val="000000"/>
-        </w:rPr>
-        <w:t xml:space="preserve"> </w:t>
-      </w:r>
-      <w:proofErr w:type="spellStart"/>
-      <w:r>
-        <w:rPr>
-          <w:rFonts w:ascii="Times New Roman" w:hAnsi="Times New Roman"/>
-          <w:color w:val="000000"/>
-        </w:rPr>
-        <w:t>xử</w:t>
-      </w:r>
-      <w:proofErr w:type="spellEnd"/>
-      <w:r>
-        <w:rPr>
-          <w:rFonts w:ascii="Times New Roman" w:hAnsi="Times New Roman"/>
-          <w:color w:val="000000"/>
-        </w:rPr>
-        <w:t xml:space="preserve"> lý khiếu nại của khách thuê, </w:t>
+        <w:t>Gửi lời mời liên kết với người thuê</w:t>
       </w:r>
     </w:p>
     <w:p>
@@ -8013,14 +8349,7 @@
           <w:rFonts w:ascii="Times New Roman" w:hAnsi="Times New Roman"/>
           <w:color w:val="000000"/>
         </w:rPr>
-        <w:t>th</w:t>
-      </w:r>
-      <w:r>
-        <w:rPr>
-          <w:rFonts w:ascii="Times New Roman" w:hAnsi="Times New Roman"/>
-          <w:color w:val="000000"/>
-        </w:rPr>
-        <w:t>ống</w:t>
+        <w:t>thống</w:t>
       </w:r>
       <w:proofErr w:type="spellEnd"/>
       <w:r>
@@ -8076,7 +8405,39 @@
           <w:rFonts w:ascii="Times New Roman" w:hAnsi="Times New Roman"/>
           <w:color w:val="000000"/>
         </w:rPr>
-        <w:t xml:space="preserve"> và tỷ lệ lấp đầy phòng.</w:t>
+        <w:t xml:space="preserve"> </w:t>
+      </w:r>
+      <w:proofErr w:type="spellStart"/>
+      <w:r>
+        <w:rPr>
+          <w:rFonts w:ascii="Times New Roman" w:hAnsi="Times New Roman"/>
+          <w:color w:val="000000"/>
+        </w:rPr>
+        <w:t>và</w:t>
+      </w:r>
+      <w:proofErr w:type="spellEnd"/>
+      <w:r>
+        <w:rPr>
+          <w:rFonts w:ascii="Times New Roman" w:hAnsi="Times New Roman"/>
+          <w:color w:val="000000"/>
+        </w:rPr>
+        <w:t xml:space="preserve"> </w:t>
+      </w:r>
+      <w:proofErr w:type="spellStart"/>
+      <w:r>
+        <w:rPr>
+          <w:rFonts w:ascii="Times New Roman" w:hAnsi="Times New Roman"/>
+          <w:color w:val="000000"/>
+        </w:rPr>
+        <w:t>tỷ</w:t>
+      </w:r>
+      <w:proofErr w:type="spellEnd"/>
+      <w:r>
+        <w:rPr>
+          <w:rFonts w:ascii="Times New Roman" w:hAnsi="Times New Roman"/>
+          <w:color w:val="000000"/>
+        </w:rPr>
+        <w:t xml:space="preserve"> lệ lấp đầy phòng.</w:t>
       </w:r>
     </w:p>
     <w:p>
@@ -8119,19 +8480,91 @@
           <w:lang w:val="vi-VN"/>
         </w:rPr>
       </w:pPr>
+      <w:r>
+        <w:rPr>
+          <w:rFonts w:ascii="Times New Roman" w:hAnsi="Times New Roman"/>
+          <w:color w:val="000000"/>
+        </w:rPr>
+        <w:t>Quản lý (</w:t>
+      </w:r>
       <w:proofErr w:type="spellStart"/>
       <w:r>
         <w:rPr>
           <w:rFonts w:ascii="Times New Roman" w:hAnsi="Times New Roman"/>
           <w:color w:val="000000"/>
         </w:rPr>
-        <w:t>Đăng</w:t>
+        <w:t>thêm</w:t>
       </w:r>
       <w:proofErr w:type="spellEnd"/>
       <w:r>
         <w:rPr>
           <w:rFonts w:ascii="Times New Roman" w:hAnsi="Times New Roman"/>
           <w:color w:val="000000"/>
+          <w:lang w:val="vi-VN"/>
+        </w:rPr>
+        <w:t xml:space="preserve">, </w:t>
+      </w:r>
+      <w:proofErr w:type="spellStart"/>
+      <w:r>
+        <w:rPr>
+          <w:rFonts w:ascii="Times New Roman" w:hAnsi="Times New Roman"/>
+          <w:color w:val="000000"/>
+        </w:rPr>
+        <w:t>sửa</w:t>
+      </w:r>
+      <w:proofErr w:type="spellEnd"/>
+      <w:r>
+        <w:rPr>
+          <w:rFonts w:ascii="Times New Roman" w:hAnsi="Times New Roman"/>
+          <w:color w:val="000000"/>
+        </w:rPr>
+        <w:t xml:space="preserve">, </w:t>
+      </w:r>
+      <w:proofErr w:type="spellStart"/>
+      <w:r>
+        <w:rPr>
+          <w:rFonts w:ascii="Times New Roman" w:hAnsi="Times New Roman"/>
+          <w:color w:val="000000"/>
+        </w:rPr>
+        <w:t>đóng</w:t>
+      </w:r>
+      <w:proofErr w:type="spellEnd"/>
+      <w:r>
+        <w:rPr>
+          <w:rFonts w:ascii="Times New Roman" w:hAnsi="Times New Roman"/>
+          <w:color w:val="000000"/>
+        </w:rPr>
+        <w:t>/</w:t>
+      </w:r>
+      <w:proofErr w:type="spellStart"/>
+      <w:r>
+        <w:rPr>
+          <w:rFonts w:ascii="Times New Roman" w:hAnsi="Times New Roman"/>
+          <w:color w:val="000000"/>
+        </w:rPr>
+        <w:t>xóa</w:t>
+      </w:r>
+      <w:proofErr w:type="spellEnd"/>
+      <w:r>
+        <w:rPr>
+          <w:rFonts w:ascii="Times New Roman" w:hAnsi="Times New Roman"/>
+          <w:color w:val="000000"/>
+        </w:rPr>
+        <w:t xml:space="preserve">) </w:t>
+      </w:r>
+      <w:proofErr w:type="spellStart"/>
+      <w:r>
+        <w:rPr>
+          <w:rFonts w:ascii="Times New Roman" w:hAnsi="Times New Roman"/>
+          <w:color w:val="000000"/>
+        </w:rPr>
+        <w:t>bài</w:t>
+      </w:r>
+      <w:proofErr w:type="spellEnd"/>
+      <w:r>
+        <w:rPr>
+          <w:rFonts w:ascii="Times New Roman" w:hAnsi="Times New Roman"/>
+          <w:color w:val="000000"/>
         </w:rPr>
         <w:t xml:space="preserve"> </w:t>
       </w:r>
@@ -8141,14 +8574,7 @@
           <w:rFonts w:ascii="Times New Roman" w:hAnsi="Times New Roman"/>
           <w:color w:val="000000"/>
         </w:rPr>
-        <w:t>nh</w:t>
-      </w:r>
-      <w:r>
-        <w:rPr>
-          <w:rFonts w:ascii="Times New Roman" w:hAnsi="Times New Roman"/>
-          <w:color w:val="000000"/>
-        </w:rPr>
-        <w:t>ập</w:t>
+        <w:t>đăng</w:t>
       </w:r>
       <w:proofErr w:type="spellEnd"/>
       <w:r>
@@ -8156,7 +8582,7 @@
           <w:rFonts w:ascii="Times New Roman" w:hAnsi="Times New Roman"/>
           <w:color w:val="000000"/>
         </w:rPr>
-        <w:t xml:space="preserve">, </w:t>
+        <w:t xml:space="preserve"> ở </w:t>
       </w:r>
       <w:proofErr w:type="spellStart"/>
       <w:r>
@@ -8164,7 +8590,7 @@
           <w:rFonts w:ascii="Times New Roman" w:hAnsi="Times New Roman"/>
           <w:color w:val="000000"/>
         </w:rPr>
-        <w:t>đăng</w:t>
+        <w:t>ghép</w:t>
       </w:r>
       <w:proofErr w:type="spellEnd"/>
       <w:r>
@@ -8172,39 +8598,7 @@
           <w:rFonts w:ascii="Times New Roman" w:hAnsi="Times New Roman"/>
           <w:color w:val="000000"/>
         </w:rPr>
-        <w:t xml:space="preserve"> </w:t>
-      </w:r>
-      <w:proofErr w:type="spellStart"/>
-      <w:r>
-        <w:rPr>
-          <w:rFonts w:ascii="Times New Roman" w:hAnsi="Times New Roman"/>
-          <w:color w:val="000000"/>
-        </w:rPr>
-        <w:t>xuất</w:t>
-      </w:r>
-      <w:proofErr w:type="spellEnd"/>
-      <w:r>
-        <w:rPr>
-          <w:rFonts w:ascii="Times New Roman" w:hAnsi="Times New Roman"/>
-          <w:color w:val="000000"/>
-        </w:rPr>
-        <w:t xml:space="preserve">, </w:t>
-      </w:r>
-      <w:proofErr w:type="spellStart"/>
-      <w:r>
-        <w:rPr>
-          <w:rFonts w:ascii="Times New Roman" w:hAnsi="Times New Roman"/>
-          <w:color w:val="000000"/>
-        </w:rPr>
-        <w:t>đổi</w:t>
-      </w:r>
-      <w:proofErr w:type="spellEnd"/>
-      <w:r>
-        <w:rPr>
-          <w:rFonts w:ascii="Times New Roman" w:hAnsi="Times New Roman"/>
-          <w:color w:val="000000"/>
-        </w:rPr>
-        <w:t xml:space="preserve"> mật khẩu, cập nhật thông tin cá nhân, </w:t>
+        <w:t>,</w:t>
       </w:r>
     </w:p>
     <w:p>
@@ -8221,13 +8615,35 @@
           <w:lang w:val="vi-VN"/>
         </w:rPr>
       </w:pPr>
+      <w:r>
+        <w:rPr>
+          <w:rFonts w:ascii="Times New Roman" w:hAnsi="Times New Roman"/>
+          <w:color w:val="000000"/>
+        </w:rPr>
+        <w:t>Quản</w:t>
+      </w:r>
+      <w:r>
+        <w:rPr>
+          <w:rFonts w:ascii="Times New Roman" w:hAnsi="Times New Roman"/>
+          <w:color w:val="000000"/>
+          <w:lang w:val="vi-VN"/>
+        </w:rPr>
+        <w:t xml:space="preserve"> lý</w:t>
+      </w:r>
+      <w:r>
+        <w:rPr>
+          <w:rFonts w:ascii="Times New Roman" w:hAnsi="Times New Roman"/>
+          <w:color w:val="000000"/>
+        </w:rPr>
+        <w:t xml:space="preserve"> </w:t>
+      </w:r>
       <w:proofErr w:type="spellStart"/>
       <w:r>
         <w:rPr>
           <w:rFonts w:ascii="Times New Roman" w:hAnsi="Times New Roman"/>
           <w:color w:val="000000"/>
         </w:rPr>
-        <w:t>Tìm</w:t>
+        <w:t>nhóm</w:t>
       </w:r>
       <w:proofErr w:type="spellEnd"/>
       <w:r>
@@ -8235,6 +8651,38 @@
           <w:rFonts w:ascii="Times New Roman" w:hAnsi="Times New Roman"/>
           <w:color w:val="000000"/>
         </w:rPr>
+        <w:t xml:space="preserve"> ở </w:t>
+      </w:r>
+      <w:proofErr w:type="spellStart"/>
+      <w:r>
+        <w:rPr>
+          <w:rFonts w:ascii="Times New Roman" w:hAnsi="Times New Roman"/>
+          <w:color w:val="000000"/>
+        </w:rPr>
+        <w:t>ghép</w:t>
+      </w:r>
+      <w:proofErr w:type="spellEnd"/>
+      <w:r>
+        <w:rPr>
+          <w:rFonts w:ascii="Times New Roman" w:hAnsi="Times New Roman"/>
+          <w:color w:val="000000"/>
+        </w:rPr>
+        <w:t xml:space="preserve">, </w:t>
+      </w:r>
+      <w:proofErr w:type="spellStart"/>
+      <w:r>
+        <w:rPr>
+          <w:rFonts w:ascii="Times New Roman" w:hAnsi="Times New Roman"/>
+          <w:color w:val="000000"/>
+        </w:rPr>
+        <w:t>duyệt</w:t>
+      </w:r>
+      <w:proofErr w:type="spellEnd"/>
+      <w:r>
+        <w:rPr>
+          <w:rFonts w:ascii="Times New Roman" w:hAnsi="Times New Roman"/>
+          <w:color w:val="000000"/>
+        </w:rPr>
         <w:t xml:space="preserve"> </w:t>
       </w:r>
       <w:proofErr w:type="spellStart"/>
@@ -8243,14 +8691,7 @@
           <w:rFonts w:ascii="Times New Roman" w:hAnsi="Times New Roman"/>
           <w:color w:val="000000"/>
         </w:rPr>
-        <w:t>ki</w:t>
-      </w:r>
-      <w:r>
-        <w:rPr>
-          <w:rFonts w:ascii="Times New Roman" w:hAnsi="Times New Roman"/>
-          <w:color w:val="000000"/>
-        </w:rPr>
-        <w:t>ếm</w:t>
+        <w:t>thành</w:t>
       </w:r>
       <w:proofErr w:type="spellEnd"/>
       <w:r>
@@ -8266,7 +8707,7 @@
           <w:rFonts w:ascii="Times New Roman" w:hAnsi="Times New Roman"/>
           <w:color w:val="000000"/>
         </w:rPr>
-        <w:t>phòng</w:t>
+        <w:t>viên</w:t>
       </w:r>
       <w:proofErr w:type="spellEnd"/>
       <w:r>
@@ -8282,7 +8723,7 @@
           <w:rFonts w:ascii="Times New Roman" w:hAnsi="Times New Roman"/>
           <w:color w:val="000000"/>
         </w:rPr>
-        <w:t>trọ</w:t>
+        <w:t>nhóm</w:t>
       </w:r>
       <w:proofErr w:type="spellEnd"/>
       <w:r>
@@ -8306,7 +8747,7 @@
           <w:rFonts w:ascii="Times New Roman" w:hAnsi="Times New Roman"/>
           <w:color w:val="000000"/>
         </w:rPr>
-        <w:t xml:space="preserve"> bài đăng ở ghép, đăng bài tìm người ở ghép (khi đã có phòng trọ hoặc chưa có phòng trọ </w:t>
+        <w:t xml:space="preserve"> </w:t>
       </w:r>
       <w:proofErr w:type="spellStart"/>
       <w:r>
@@ -8314,7 +8755,7 @@
           <w:rFonts w:ascii="Times New Roman" w:hAnsi="Times New Roman"/>
           <w:color w:val="000000"/>
         </w:rPr>
-        <w:t>theo</w:t>
+        <w:t>cập</w:t>
       </w:r>
       <w:proofErr w:type="spellEnd"/>
       <w:r>
@@ -8330,7 +8771,7 @@
           <w:rFonts w:ascii="Times New Roman" w:hAnsi="Times New Roman"/>
           <w:color w:val="000000"/>
         </w:rPr>
-        <w:t>bản</w:t>
+        <w:t>nhật</w:t>
       </w:r>
       <w:proofErr w:type="spellEnd"/>
       <w:r>
@@ -8346,7 +8787,7 @@
           <w:rFonts w:ascii="Times New Roman" w:hAnsi="Times New Roman"/>
           <w:color w:val="000000"/>
         </w:rPr>
-        <w:t>đồ</w:t>
+        <w:t>lối</w:t>
       </w:r>
       <w:proofErr w:type="spellEnd"/>
       <w:r>
@@ -8354,7 +8795,39 @@
           <w:rFonts w:ascii="Times New Roman" w:hAnsi="Times New Roman"/>
           <w:color w:val="000000"/>
         </w:rPr>
-        <w:t xml:space="preserve">), </w:t>
+        <w:t xml:space="preserve"> </w:t>
+      </w:r>
+      <w:proofErr w:type="spellStart"/>
+      <w:r>
+        <w:rPr>
+          <w:rFonts w:ascii="Times New Roman" w:hAnsi="Times New Roman"/>
+          <w:color w:val="000000"/>
+        </w:rPr>
+        <w:t>sống</w:t>
+      </w:r>
+      <w:proofErr w:type="spellEnd"/>
+      <w:r>
+        <w:rPr>
+          <w:rFonts w:ascii="Times New Roman" w:hAnsi="Times New Roman"/>
+          <w:color w:val="000000"/>
+        </w:rPr>
+        <w:t xml:space="preserve"> </w:t>
+      </w:r>
+      <w:proofErr w:type="spellStart"/>
+      <w:r>
+        <w:rPr>
+          <w:rFonts w:ascii="Times New Roman" w:hAnsi="Times New Roman"/>
+          <w:color w:val="000000"/>
+        </w:rPr>
+        <w:t>chung</w:t>
+      </w:r>
+      <w:proofErr w:type="spellEnd"/>
+      <w:r>
+        <w:rPr>
+          <w:rFonts w:ascii="Times New Roman" w:hAnsi="Times New Roman"/>
+          <w:color w:val="000000"/>
+        </w:rPr>
+        <w:t xml:space="preserve">, </w:t>
       </w:r>
     </w:p>
     <w:p>
@@ -8371,20 +8844,13 @@
           <w:lang w:val="vi-VN"/>
         </w:rPr>
       </w:pPr>
-      <w:r>
-        <w:rPr>
-          <w:rFonts w:ascii="Times New Roman" w:hAnsi="Times New Roman"/>
-          <w:color w:val="000000"/>
-        </w:rPr>
-        <w:t>Quản lý (</w:t>
-      </w:r>
       <w:proofErr w:type="spellStart"/>
       <w:r>
         <w:rPr>
           <w:rFonts w:ascii="Times New Roman" w:hAnsi="Times New Roman"/>
           <w:color w:val="000000"/>
         </w:rPr>
-        <w:t>sửa</w:t>
+        <w:t>Xác</w:t>
       </w:r>
       <w:proofErr w:type="spellEnd"/>
       <w:r>
@@ -8392,7 +8858,7 @@
           <w:rFonts w:ascii="Times New Roman" w:hAnsi="Times New Roman"/>
           <w:color w:val="000000"/>
         </w:rPr>
-        <w:t xml:space="preserve">, </w:t>
+        <w:t xml:space="preserve"> </w:t>
       </w:r>
       <w:proofErr w:type="spellStart"/>
       <w:r>
@@ -8400,7 +8866,7 @@
           <w:rFonts w:ascii="Times New Roman" w:hAnsi="Times New Roman"/>
           <w:color w:val="000000"/>
         </w:rPr>
-        <w:t>đóng</w:t>
+        <w:t>nhận</w:t>
       </w:r>
       <w:proofErr w:type="spellEnd"/>
       <w:r>
@@ -8408,7 +8874,7 @@
           <w:rFonts w:ascii="Times New Roman" w:hAnsi="Times New Roman"/>
           <w:color w:val="000000"/>
         </w:rPr>
-        <w:t>/</w:t>
+        <w:t xml:space="preserve"> </w:t>
       </w:r>
       <w:proofErr w:type="spellStart"/>
       <w:r>
@@ -8416,7 +8882,7 @@
           <w:rFonts w:ascii="Times New Roman" w:hAnsi="Times New Roman"/>
           <w:color w:val="000000"/>
         </w:rPr>
-        <w:t>xóa</w:t>
+        <w:t>liên</w:t>
       </w:r>
       <w:proofErr w:type="spellEnd"/>
       <w:r>
@@ -8424,7 +8890,7 @@
           <w:rFonts w:ascii="Times New Roman" w:hAnsi="Times New Roman"/>
           <w:color w:val="000000"/>
         </w:rPr>
-        <w:t xml:space="preserve">) </w:t>
+        <w:t xml:space="preserve"> </w:t>
       </w:r>
       <w:proofErr w:type="spellStart"/>
       <w:r>
@@ -8432,7 +8898,7 @@
           <w:rFonts w:ascii="Times New Roman" w:hAnsi="Times New Roman"/>
           <w:color w:val="000000"/>
         </w:rPr>
-        <w:t>bài</w:t>
+        <w:t>kết</w:t>
       </w:r>
       <w:proofErr w:type="spellEnd"/>
       <w:r>
@@ -8448,7 +8914,7 @@
           <w:rFonts w:ascii="Times New Roman" w:hAnsi="Times New Roman"/>
           <w:color w:val="000000"/>
         </w:rPr>
-        <w:t>đăng</w:t>
+        <w:t>phòng</w:t>
       </w:r>
       <w:proofErr w:type="spellEnd"/>
       <w:r>
@@ -8456,7 +8922,55 @@
           <w:rFonts w:ascii="Times New Roman" w:hAnsi="Times New Roman"/>
           <w:color w:val="000000"/>
         </w:rPr>
-        <w:t xml:space="preserve"> ở ghép, xin gia nhập nhóm ở ghép, duyệt thành viên nhóm và cập nhật lối sống chung, </w:t>
+        <w:t xml:space="preserve"> </w:t>
+      </w:r>
+      <w:proofErr w:type="spellStart"/>
+      <w:r>
+        <w:rPr>
+          <w:rFonts w:ascii="Times New Roman" w:hAnsi="Times New Roman"/>
+          <w:color w:val="000000"/>
+        </w:rPr>
+        <w:t>trọ</w:t>
+      </w:r>
+      <w:proofErr w:type="spellEnd"/>
+      <w:r>
+        <w:rPr>
+          <w:rFonts w:ascii="Times New Roman" w:hAnsi="Times New Roman"/>
+          <w:color w:val="000000"/>
+        </w:rPr>
+        <w:t xml:space="preserve"> </w:t>
+      </w:r>
+      <w:proofErr w:type="spellStart"/>
+      <w:r>
+        <w:rPr>
+          <w:rFonts w:ascii="Times New Roman" w:hAnsi="Times New Roman"/>
+          <w:color w:val="000000"/>
+        </w:rPr>
+        <w:t>với</w:t>
+      </w:r>
+      <w:proofErr w:type="spellEnd"/>
+      <w:r>
+        <w:rPr>
+          <w:rFonts w:ascii="Times New Roman" w:hAnsi="Times New Roman"/>
+          <w:color w:val="000000"/>
+        </w:rPr>
+        <w:t xml:space="preserve"> </w:t>
+      </w:r>
+      <w:proofErr w:type="spellStart"/>
+      <w:r>
+        <w:rPr>
+          <w:rFonts w:ascii="Times New Roman" w:hAnsi="Times New Roman"/>
+          <w:color w:val="000000"/>
+        </w:rPr>
+        <w:t>chủ</w:t>
+      </w:r>
+      <w:proofErr w:type="spellEnd"/>
+      <w:r>
+        <w:rPr>
+          <w:rFonts w:ascii="Times New Roman" w:hAnsi="Times New Roman"/>
+          <w:color w:val="000000"/>
+        </w:rPr>
+        <w:t xml:space="preserve"> trọ, </w:t>
       </w:r>
     </w:p>
     <w:p>
@@ -8473,13 +8987,20 @@
           <w:lang w:val="vi-VN"/>
         </w:rPr>
       </w:pPr>
+      <w:r>
+        <w:rPr>
+          <w:rFonts w:ascii="Times New Roman" w:hAnsi="Times New Roman"/>
+          <w:color w:val="000000"/>
+        </w:rPr>
+        <w:t xml:space="preserve">Xem </w:t>
+      </w:r>
       <w:proofErr w:type="spellStart"/>
       <w:r>
         <w:rPr>
           <w:rFonts w:ascii="Times New Roman" w:hAnsi="Times New Roman"/>
           <w:color w:val="000000"/>
         </w:rPr>
-        <w:t>Xác</w:t>
+        <w:t>hợp</w:t>
       </w:r>
       <w:proofErr w:type="spellEnd"/>
       <w:r>
@@ -8495,70 +9016,16 @@
           <w:rFonts w:ascii="Times New Roman" w:hAnsi="Times New Roman"/>
           <w:color w:val="000000"/>
         </w:rPr>
-        <w:t>nh</w:t>
-      </w:r>
-      <w:r>
-        <w:rPr>
-          <w:rFonts w:ascii="Times New Roman" w:hAnsi="Times New Roman"/>
-          <w:color w:val="000000"/>
-        </w:rPr>
-        <w:t>ận</w:t>
+        <w:t>đồng</w:t>
       </w:r>
       <w:proofErr w:type="spellEnd"/>
       <w:r>
         <w:rPr>
           <w:rFonts w:ascii="Times New Roman" w:hAnsi="Times New Roman"/>
           <w:color w:val="000000"/>
-        </w:rPr>
-        <w:t xml:space="preserve"> </w:t>
-      </w:r>
-      <w:proofErr w:type="spellStart"/>
-      <w:r>
-        <w:rPr>
-          <w:rFonts w:ascii="Times New Roman" w:hAnsi="Times New Roman"/>
-          <w:color w:val="000000"/>
-        </w:rPr>
-        <w:t>liên</w:t>
-      </w:r>
-      <w:proofErr w:type="spellEnd"/>
-      <w:r>
-        <w:rPr>
-          <w:rFonts w:ascii="Times New Roman" w:hAnsi="Times New Roman"/>
-          <w:color w:val="000000"/>
-        </w:rPr>
-        <w:t xml:space="preserve"> </w:t>
-      </w:r>
-      <w:proofErr w:type="spellStart"/>
-      <w:r>
-        <w:rPr>
-          <w:rFonts w:ascii="Times New Roman" w:hAnsi="Times New Roman"/>
-          <w:color w:val="000000"/>
-        </w:rPr>
-        <w:t>kết</w:t>
-      </w:r>
-      <w:proofErr w:type="spellEnd"/>
-      <w:r>
-        <w:rPr>
-          <w:rFonts w:ascii="Times New Roman" w:hAnsi="Times New Roman"/>
-          <w:color w:val="000000"/>
-        </w:rPr>
-        <w:t xml:space="preserve"> </w:t>
-      </w:r>
-      <w:proofErr w:type="spellStart"/>
-      <w:r>
-        <w:rPr>
-          <w:rFonts w:ascii="Times New Roman" w:hAnsi="Times New Roman"/>
-          <w:color w:val="000000"/>
-        </w:rPr>
-        <w:t>phòng</w:t>
-      </w:r>
-      <w:proofErr w:type="spellEnd"/>
-      <w:r>
-        <w:rPr>
-          <w:rFonts w:ascii="Times New Roman" w:hAnsi="Times New Roman"/>
-          <w:color w:val="000000"/>
-        </w:rPr>
-        <w:t xml:space="preserve"> trọ với chủ trọ, </w:t>
+          <w:lang w:val="vi-VN"/>
+        </w:rPr>
+        <w:t xml:space="preserve"> phòng trọ</w:t>
       </w:r>
     </w:p>
     <w:p>
@@ -8579,7 +9046,9 @@
         <w:rPr>
           <w:rFonts w:ascii="Times New Roman" w:hAnsi="Times New Roman"/>
           <w:color w:val="000000"/>
-        </w:rPr>
+          <w:lang w:val="vi-VN"/>
+        </w:rPr>
+        <w:lastRenderedPageBreak/>
         <w:t xml:space="preserve">Xem </w:t>
       </w:r>
       <w:proofErr w:type="spellStart"/>
@@ -8588,14 +9057,7 @@
           <w:rFonts w:ascii="Times New Roman" w:hAnsi="Times New Roman"/>
           <w:color w:val="000000"/>
         </w:rPr>
-        <w:t>h</w:t>
-      </w:r>
-      <w:r>
-        <w:rPr>
-          <w:rFonts w:ascii="Times New Roman" w:hAnsi="Times New Roman"/>
-          <w:color w:val="000000"/>
-        </w:rPr>
-        <w:t>ợp</w:t>
+        <w:t>lịch</w:t>
       </w:r>
       <w:proofErr w:type="spellEnd"/>
       <w:r>
@@ -8611,7 +9073,7 @@
           <w:rFonts w:ascii="Times New Roman" w:hAnsi="Times New Roman"/>
           <w:color w:val="000000"/>
         </w:rPr>
-        <w:t>đồng</w:t>
+        <w:t>sử</w:t>
       </w:r>
       <w:proofErr w:type="spellEnd"/>
       <w:r>
@@ -8620,38 +9082,6 @@
           <w:color w:val="000000"/>
         </w:rPr>
         <w:t xml:space="preserve"> </w:t>
-      </w:r>
-      <w:proofErr w:type="spellStart"/>
-      <w:r>
-        <w:rPr>
-          <w:rFonts w:ascii="Times New Roman" w:hAnsi="Times New Roman"/>
-          <w:color w:val="000000"/>
-        </w:rPr>
-        <w:t>và</w:t>
-      </w:r>
-      <w:proofErr w:type="spellEnd"/>
-      <w:r>
-        <w:rPr>
-          <w:rFonts w:ascii="Times New Roman" w:hAnsi="Times New Roman"/>
-          <w:color w:val="000000"/>
-        </w:rPr>
-        <w:t xml:space="preserve"> </w:t>
-      </w:r>
-      <w:proofErr w:type="spellStart"/>
-      <w:r>
-        <w:rPr>
-          <w:rFonts w:ascii="Times New Roman" w:hAnsi="Times New Roman"/>
-          <w:color w:val="000000"/>
-        </w:rPr>
-        <w:t>lịch</w:t>
-      </w:r>
-      <w:proofErr w:type="spellEnd"/>
-      <w:r>
-        <w:rPr>
-          <w:rFonts w:ascii="Times New Roman" w:hAnsi="Times New Roman"/>
-          <w:color w:val="000000"/>
-        </w:rPr>
-        <w:t xml:space="preserve"> sử </w:t>
       </w:r>
       <w:proofErr w:type="spellStart"/>
       <w:r>
@@ -8726,14 +9156,7 @@
           <w:rFonts w:ascii="Times New Roman" w:hAnsi="Times New Roman"/>
           <w:color w:val="000000"/>
         </w:rPr>
-        <w:t>G</w:t>
-      </w:r>
-      <w:r>
-        <w:rPr>
-          <w:rFonts w:ascii="Times New Roman" w:hAnsi="Times New Roman"/>
-          <w:color w:val="000000"/>
-        </w:rPr>
-        <w:t>ửi</w:t>
+        <w:t>Gửi</w:t>
       </w:r>
       <w:proofErr w:type="spellEnd"/>
       <w:r>
@@ -8772,24 +9195,16 @@
         <w:rPr>
           <w:rFonts w:ascii="Times New Roman" w:hAnsi="Times New Roman"/>
           <w:color w:val="000000"/>
-        </w:rPr>
-        <w:t xml:space="preserve"> </w:t>
-      </w:r>
-      <w:proofErr w:type="spellStart"/>
-      <w:r>
-        <w:rPr>
-          <w:rFonts w:ascii="Times New Roman" w:hAnsi="Times New Roman"/>
-          <w:color w:val="000000"/>
-        </w:rPr>
-        <w:t>và</w:t>
-      </w:r>
-      <w:proofErr w:type="spellEnd"/>
-      <w:r>
-        <w:rPr>
-          <w:rFonts w:ascii="Times New Roman" w:hAnsi="Times New Roman"/>
-          <w:color w:val="000000"/>
-        </w:rPr>
-        <w:t xml:space="preserve"> theo dõi tiến độ sửa chữa.</w:t>
+          <w:lang w:val="vi-VN"/>
+        </w:rPr>
+        <w:t xml:space="preserve"> chủ trọ cho admin</w:t>
+      </w:r>
+      <w:r>
+        <w:rPr>
+          <w:rFonts w:ascii="Times New Roman" w:hAnsi="Times New Roman"/>
+          <w:color w:val="000000"/>
+        </w:rPr>
+        <w:t>.</w:t>
       </w:r>
     </w:p>
     <w:p>
@@ -8815,7 +9230,7 @@
           <w:rFonts w:ascii="Times New Roman" w:hAnsi="Times New Roman"/>
           <w:color w:val="000000"/>
         </w:rPr>
-        <w:t xml:space="preserve"> đăng nhập, đăng xuất, đổi mật khẩu, cập nhật thông tin cá nhân, </w:t>
+        <w:t xml:space="preserve"> </w:t>
       </w:r>
     </w:p>
     <w:p>
@@ -8837,14 +9252,7 @@
           <w:rFonts w:ascii="Times New Roman" w:hAnsi="Times New Roman"/>
           <w:color w:val="000000"/>
         </w:rPr>
-        <w:t>Qu</w:t>
-      </w:r>
-      <w:r>
-        <w:rPr>
-          <w:rFonts w:ascii="Times New Roman" w:hAnsi="Times New Roman"/>
-          <w:color w:val="000000"/>
-        </w:rPr>
-        <w:t xml:space="preserve">ản </w:t>
+        <w:t xml:space="preserve">Quản </w:t>
       </w:r>
       <w:proofErr w:type="spellStart"/>
       <w:r>
@@ -8892,7 +9300,23 @@
           <w:rFonts w:ascii="Times New Roman" w:hAnsi="Times New Roman"/>
           <w:color w:val="000000"/>
         </w:rPr>
-        <w:t xml:space="preserve"> người dùng (thêm, sửa, phân quyền, khóa/mở khóa), </w:t>
+        <w:t xml:space="preserve"> </w:t>
+      </w:r>
+      <w:proofErr w:type="spellStart"/>
+      <w:r>
+        <w:rPr>
+          <w:rFonts w:ascii="Times New Roman" w:hAnsi="Times New Roman"/>
+          <w:color w:val="000000"/>
+        </w:rPr>
+        <w:t>người</w:t>
+      </w:r>
+      <w:proofErr w:type="spellEnd"/>
+      <w:r>
+        <w:rPr>
+          <w:rFonts w:ascii="Times New Roman" w:hAnsi="Times New Roman"/>
+          <w:color w:val="000000"/>
+        </w:rPr>
+        <w:t xml:space="preserve"> dùng (thêm, sửa, phân quyền, khóa/mở khóa), </w:t>
       </w:r>
     </w:p>
     <w:p>
@@ -8914,21 +9338,15 @@
           <w:rFonts w:ascii="Times New Roman" w:hAnsi="Times New Roman"/>
           <w:color w:val="000000"/>
         </w:rPr>
-        <w:t>Qu</w:t>
-      </w:r>
-      <w:r>
-        <w:rPr>
-          <w:rFonts w:ascii="Times New Roman" w:hAnsi="Times New Roman"/>
-          <w:color w:val="000000"/>
-        </w:rPr>
-        <w:t>ả</w:t>
-      </w:r>
-      <w:r>
-        <w:rPr>
-          <w:rFonts w:ascii="Times New Roman" w:hAnsi="Times New Roman"/>
-          <w:color w:val="000000"/>
-        </w:rPr>
-        <w:t xml:space="preserve">n </w:t>
+        <w:t>Quản</w:t>
+      </w:r>
+      <w:r>
+        <w:rPr>
+          <w:rFonts w:ascii="Times New Roman" w:hAnsi="Times New Roman"/>
+          <w:color w:val="000000"/>
+          <w:lang w:val="vi-VN"/>
+        </w:rPr>
+        <w:t xml:space="preserve"> lý </w:t>
       </w:r>
       <w:proofErr w:type="spellStart"/>
       <w:r>
@@ -8936,6 +9354,78 @@
           <w:rFonts w:ascii="Times New Roman" w:hAnsi="Times New Roman"/>
           <w:color w:val="000000"/>
         </w:rPr>
+        <w:t>khiếu</w:t>
+      </w:r>
+      <w:proofErr w:type="spellEnd"/>
+      <w:r>
+        <w:rPr>
+          <w:rFonts w:ascii="Times New Roman" w:hAnsi="Times New Roman"/>
+          <w:color w:val="000000"/>
+        </w:rPr>
+        <w:t xml:space="preserve"> </w:t>
+      </w:r>
+      <w:proofErr w:type="spellStart"/>
+      <w:r>
+        <w:rPr>
+          <w:rFonts w:ascii="Times New Roman" w:hAnsi="Times New Roman"/>
+          <w:color w:val="000000"/>
+        </w:rPr>
+        <w:t>nại</w:t>
+      </w:r>
+      <w:proofErr w:type="spellEnd"/>
+      <w:r>
+        <w:rPr>
+          <w:rFonts w:ascii="Times New Roman" w:hAnsi="Times New Roman"/>
+          <w:color w:val="000000"/>
+          <w:lang w:val="vi-VN"/>
+        </w:rPr>
+        <w:t xml:space="preserve"> (duyệt, xem</w:t>
+      </w:r>
+      <w:r>
+        <w:rPr>
+          <w:rFonts w:ascii="Times New Roman" w:hAnsi="Times New Roman"/>
+          <w:color w:val="000000"/>
+        </w:rPr>
+        <w:t xml:space="preserve"> </w:t>
+      </w:r>
+      <w:proofErr w:type="spellStart"/>
+      <w:r>
+        <w:rPr>
+          <w:rFonts w:ascii="Times New Roman" w:hAnsi="Times New Roman"/>
+          <w:color w:val="000000"/>
+        </w:rPr>
+        <w:t>và</w:t>
+      </w:r>
+      <w:proofErr w:type="spellEnd"/>
+      <w:r>
+        <w:rPr>
+          <w:rFonts w:ascii="Times New Roman" w:hAnsi="Times New Roman"/>
+          <w:color w:val="000000"/>
+        </w:rPr>
+        <w:t xml:space="preserve"> </w:t>
+      </w:r>
+      <w:proofErr w:type="spellStart"/>
+      <w:r>
+        <w:rPr>
+          <w:rFonts w:ascii="Times New Roman" w:hAnsi="Times New Roman"/>
+          <w:color w:val="000000"/>
+        </w:rPr>
+        <w:t>xử</w:t>
+      </w:r>
+      <w:proofErr w:type="spellEnd"/>
+      <w:r>
+        <w:rPr>
+          <w:rFonts w:ascii="Times New Roman" w:hAnsi="Times New Roman"/>
+          <w:color w:val="000000"/>
+        </w:rPr>
+        <w:t xml:space="preserve"> </w:t>
+      </w:r>
+      <w:proofErr w:type="spellStart"/>
+      <w:r>
+        <w:rPr>
+          <w:rFonts w:ascii="Times New Roman" w:hAnsi="Times New Roman"/>
+          <w:color w:val="000000"/>
+        </w:rPr>
         <w:t>lý</w:t>
       </w:r>
       <w:proofErr w:type="spellEnd"/>
@@ -8944,7 +9434,7 @@
           <w:rFonts w:ascii="Times New Roman" w:hAnsi="Times New Roman"/>
           <w:color w:val="000000"/>
         </w:rPr>
-        <w:t xml:space="preserve"> master data (</w:t>
+        <w:t xml:space="preserve"> vi </w:t>
       </w:r>
       <w:proofErr w:type="spellStart"/>
       <w:r>
@@ -8952,7 +9442,7 @@
           <w:rFonts w:ascii="Times New Roman" w:hAnsi="Times New Roman"/>
           <w:color w:val="000000"/>
         </w:rPr>
-        <w:t>thêm</w:t>
+        <w:t>phạm</w:t>
       </w:r>
       <w:proofErr w:type="spellEnd"/>
       <w:r>
@@ -8960,7 +9450,7 @@
           <w:rFonts w:ascii="Times New Roman" w:hAnsi="Times New Roman"/>
           <w:color w:val="000000"/>
         </w:rPr>
-        <w:t xml:space="preserve">, </w:t>
+        <w:t xml:space="preserve"> </w:t>
       </w:r>
       <w:proofErr w:type="spellStart"/>
       <w:r>
@@ -8968,14 +9458,7 @@
           <w:rFonts w:ascii="Times New Roman" w:hAnsi="Times New Roman"/>
           <w:color w:val="000000"/>
         </w:rPr>
-        <w:t>s</w:t>
-      </w:r>
-      <w:r>
-        <w:rPr>
-          <w:rFonts w:ascii="Times New Roman" w:hAnsi="Times New Roman"/>
-          <w:color w:val="000000"/>
-        </w:rPr>
-        <w:t>ửa</w:t>
+        <w:t>toàn</w:t>
       </w:r>
       <w:proofErr w:type="spellEnd"/>
       <w:r>
@@ -8983,7 +9466,7 @@
           <w:rFonts w:ascii="Times New Roman" w:hAnsi="Times New Roman"/>
           <w:color w:val="000000"/>
         </w:rPr>
-        <w:t xml:space="preserve">, </w:t>
+        <w:t xml:space="preserve"> </w:t>
       </w:r>
       <w:proofErr w:type="spellStart"/>
       <w:r>
@@ -8991,133 +9474,23 @@
           <w:rFonts w:ascii="Times New Roman" w:hAnsi="Times New Roman"/>
           <w:color w:val="000000"/>
         </w:rPr>
-        <w:t>xóa</w:t>
+        <w:t>sàn</w:t>
       </w:r>
       <w:proofErr w:type="spellEnd"/>
       <w:r>
         <w:rPr>
           <w:rFonts w:ascii="Times New Roman" w:hAnsi="Times New Roman"/>
           <w:color w:val="000000"/>
+          <w:lang w:val="vi-VN"/>
+        </w:rPr>
+        <w:t>)</w:t>
+      </w:r>
+      <w:r>
+        <w:rPr>
+          <w:rFonts w:ascii="Times New Roman" w:hAnsi="Times New Roman"/>
+          <w:color w:val="000000"/>
         </w:rPr>
         <w:t xml:space="preserve"> </w:t>
-      </w:r>
-      <w:proofErr w:type="spellStart"/>
-      <w:r>
-        <w:rPr>
-          <w:rFonts w:ascii="Times New Roman" w:hAnsi="Times New Roman"/>
-          <w:color w:val="000000"/>
-        </w:rPr>
-        <w:t>danh</w:t>
-      </w:r>
-      <w:proofErr w:type="spellEnd"/>
-      <w:r>
-        <w:rPr>
-          <w:rFonts w:ascii="Times New Roman" w:hAnsi="Times New Roman"/>
-          <w:color w:val="000000"/>
-        </w:rPr>
-        <w:t xml:space="preserve"> </w:t>
-      </w:r>
-      <w:proofErr w:type="spellStart"/>
-      <w:r>
-        <w:rPr>
-          <w:rFonts w:ascii="Times New Roman" w:hAnsi="Times New Roman"/>
-          <w:color w:val="000000"/>
-        </w:rPr>
-        <w:t>mục</w:t>
-      </w:r>
-      <w:proofErr w:type="spellEnd"/>
-      <w:r>
-        <w:rPr>
-          <w:rFonts w:ascii="Times New Roman" w:hAnsi="Times New Roman"/>
-          <w:color w:val="000000"/>
-        </w:rPr>
-        <w:t xml:space="preserve"> tiện ích và tiêu chí lối sống), </w:t>
-      </w:r>
-    </w:p>
-    <w:p>
-      <w:pPr>
-        <w:pStyle w:val="ListParagraph"/>
-        <w:numPr>
-          <w:ilvl w:val="0"/>
-          <w:numId w:val="12"/>
-        </w:numPr>
-        <w:spacing w:before="40" w:after="40" w:line="288" w:lineRule="auto"/>
-        <w:rPr>
-          <w:rFonts w:ascii="Times New Roman" w:hAnsi="Times New Roman"/>
-          <w:color w:val="000000"/>
-          <w:lang w:val="vi-VN"/>
-        </w:rPr>
-      </w:pPr>
-      <w:proofErr w:type="spellStart"/>
-      <w:r>
-        <w:rPr>
-          <w:rFonts w:ascii="Times New Roman" w:hAnsi="Times New Roman"/>
-          <w:color w:val="000000"/>
-        </w:rPr>
-        <w:t>Duy</w:t>
-      </w:r>
-      <w:r>
-        <w:rPr>
-          <w:rFonts w:ascii="Times New Roman" w:hAnsi="Times New Roman"/>
-          <w:color w:val="000000"/>
-        </w:rPr>
-        <w:t>ệt</w:t>
-      </w:r>
-      <w:proofErr w:type="spellEnd"/>
-      <w:r>
-        <w:rPr>
-          <w:rFonts w:ascii="Times New Roman" w:hAnsi="Times New Roman"/>
-          <w:color w:val="000000"/>
-        </w:rPr>
-        <w:t xml:space="preserve"> </w:t>
-      </w:r>
-      <w:proofErr w:type="spellStart"/>
-      <w:r>
-        <w:rPr>
-          <w:rFonts w:ascii="Times New Roman" w:hAnsi="Times New Roman"/>
-          <w:color w:val="000000"/>
-        </w:rPr>
-        <w:t>khiếu</w:t>
-      </w:r>
-      <w:proofErr w:type="spellEnd"/>
-      <w:r>
-        <w:rPr>
-          <w:rFonts w:ascii="Times New Roman" w:hAnsi="Times New Roman"/>
-          <w:color w:val="000000"/>
-        </w:rPr>
-        <w:t xml:space="preserve"> </w:t>
-      </w:r>
-      <w:proofErr w:type="spellStart"/>
-      <w:r>
-        <w:rPr>
-          <w:rFonts w:ascii="Times New Roman" w:hAnsi="Times New Roman"/>
-          <w:color w:val="000000"/>
-        </w:rPr>
-        <w:t>nại</w:t>
-      </w:r>
-      <w:proofErr w:type="spellEnd"/>
-      <w:r>
-        <w:rPr>
-          <w:rFonts w:ascii="Times New Roman" w:hAnsi="Times New Roman"/>
-          <w:color w:val="000000"/>
-        </w:rPr>
-        <w:t xml:space="preserve"> </w:t>
-      </w:r>
-      <w:proofErr w:type="spellStart"/>
-      <w:r>
-        <w:rPr>
-          <w:rFonts w:ascii="Times New Roman" w:hAnsi="Times New Roman"/>
-          <w:color w:val="000000"/>
-        </w:rPr>
-        <w:t>và</w:t>
-      </w:r>
-      <w:proofErr w:type="spellEnd"/>
-      <w:r>
-        <w:rPr>
-          <w:rFonts w:ascii="Times New Roman" w:hAnsi="Times New Roman"/>
-          <w:color w:val="000000"/>
-        </w:rPr>
-        <w:t xml:space="preserve"> xử lý vi phạm toàn sàn, </w:t>
       </w:r>
     </w:p>
     <w:p>
@@ -9142,14 +9515,7 @@
           <w:rFonts w:ascii="Times New Roman" w:hAnsi="Times New Roman"/>
           <w:color w:val="000000"/>
         </w:rPr>
-        <w:t>th</w:t>
-      </w:r>
-      <w:r>
-        <w:rPr>
-          <w:rFonts w:ascii="Times New Roman" w:hAnsi="Times New Roman"/>
-          <w:color w:val="000000"/>
-        </w:rPr>
-        <w:t>ống</w:t>
+        <w:t>thống</w:t>
       </w:r>
       <w:proofErr w:type="spellEnd"/>
       <w:r>
@@ -9278,462 +9644,825 @@
         <w:spacing w:before="40" w:after="40" w:line="288" w:lineRule="auto"/>
         <w:ind w:left="288"/>
       </w:pPr>
-      <w:r>
-        <w:rPr>
-          <w:rFonts w:ascii="Times New Roman" w:hAnsi="Times New Roman"/>
-          <w:b/>
-          <w:color w:val="000000"/>
-        </w:rPr>
-        <w:t>Login (Đăng nhập):</w:t>
-      </w:r>
-      <w:r>
-        <w:rPr>
-          <w:rFonts w:ascii="Times New Roman" w:hAnsi="Times New Roman"/>
-          <w:color w:val="000000"/>
-        </w:rPr>
-        <w:t xml:space="preserve"> UC này cho phép người dùng (Chủ trọ, Người thuê hoặc Quản trị viên) sử dụng tài khoản đã có trong hệ thống để thực hiện truy cập vào hệ thống.</w:t>
-      </w:r>
     </w:p>
     <w:p>
       <w:pPr>
-        <w:spacing w:before="40" w:after="40" w:line="288" w:lineRule="auto"/>
-        <w:ind w:left="288"/>
+        <w:keepNext/>
+        <w:spacing w:before="240" w:after="80"/>
       </w:pPr>
       <w:r>
         <w:rPr>
           <w:rFonts w:ascii="Times New Roman" w:hAnsi="Times New Roman"/>
           <w:b/>
-          <w:color w:val="000000"/>
-        </w:rPr>
-        <w:t>Logout (Đăng xuất):</w:t>
-      </w:r>
-      <w:r>
-        <w:rPr>
-          <w:rFonts w:ascii="Times New Roman" w:hAnsi="Times New Roman"/>
-          <w:color w:val="000000"/>
-        </w:rPr>
-        <w:t xml:space="preserve"> UC này cho phép người dùng thoát ra khỏi tài khoản đã đăng nhập hiện tại.</w:t>
+          <w:i w:val="0"/>
+          <w:color w:val="0F4C81"/>
+          <w:sz w:val="23"/>
+        </w:rPr>
+        <w:t>1. Nhóm Use case cho Tác nhân User (Người dùng hệ thống - Dùng chung)</w:t>
       </w:r>
     </w:p>
     <w:p>
       <w:pPr>
-        <w:spacing w:before="40" w:after="40" w:line="288" w:lineRule="auto"/>
-        <w:ind w:left="288"/>
+        <w:spacing w:before="60" w:after="80" w:line="288" w:lineRule="auto"/>
+        <w:ind w:left="360" w:hanging="360"/>
       </w:pPr>
       <w:r>
         <w:rPr>
           <w:rFonts w:ascii="Times New Roman" w:hAnsi="Times New Roman"/>
           <w:b/>
-          <w:color w:val="000000"/>
-        </w:rPr>
-        <w:t>Change password (Đổi mật khẩu):</w:t>
-      </w:r>
-      <w:r>
-        <w:rPr>
-          <w:rFonts w:ascii="Times New Roman" w:hAnsi="Times New Roman"/>
-          <w:color w:val="000000"/>
-        </w:rPr>
-        <w:t xml:space="preserve"> UC này cho phép người dùng thay đổi mật khẩu của tài khoản mà người dùng đang sử dụng hiện tại.</w:t>
+          <w:i w:val="0"/>
+          <w:color w:val="1E3A8A"/>
+          <w:sz w:val="22"/>
+        </w:rPr>
+        <w:t xml:space="preserve">• </w:t>
+      </w:r>
+      <w:r>
+        <w:rPr>
+          <w:rFonts w:ascii="Times New Roman" w:hAnsi="Times New Roman"/>
+          <w:b/>
+          <w:i w:val="0"/>
+          <w:color w:val="0F172A"/>
+          <w:sz w:val="22"/>
+        </w:rPr>
+        <w:t xml:space="preserve">Login (Đăng nhập): </w:t>
+      </w:r>
+      <w:r>
+        <w:rPr>
+          <w:rFonts w:ascii="Times New Roman" w:hAnsi="Times New Roman"/>
+          <w:b w:val="0"/>
+          <w:i w:val="0"/>
+          <w:color w:val="1E293B"/>
+          <w:sz w:val="22"/>
+        </w:rPr>
+        <w:t>Use case này cho phép người dùng (Chủ trọ, Người thuê hoặc Quản trị viên) đăng nhập vào hệ thống bằng tên đăng nhập/email và mật khẩu. Hệ thống xác thực danh tính qua cơ chế Spring Security kết hợp JSON Web Token (JWT) stateless claims-based (chứa userId, username, email, role, fullName) và tự động điều hướng người dùng về đúng không gian làm việc theo vai trò (Chủ trọ về Dashboard quản lý trọ, Quản trị viên về Cổng admin, Người thuê về Trang tìm kiếm phòng và ở ghép).</w:t>
       </w:r>
     </w:p>
     <w:p>
       <w:pPr>
-        <w:spacing w:before="40" w:after="40" w:line="288" w:lineRule="auto"/>
-        <w:ind w:left="288"/>
+        <w:spacing w:before="60" w:after="80" w:line="288" w:lineRule="auto"/>
+        <w:ind w:left="360" w:hanging="360"/>
       </w:pPr>
       <w:r>
         <w:rPr>
           <w:rFonts w:ascii="Times New Roman" w:hAnsi="Times New Roman"/>
           <w:b/>
-          <w:color w:val="000000"/>
-        </w:rPr>
-        <w:t>Register (Đăng ký tài khoản):</w:t>
-      </w:r>
-      <w:r>
-        <w:rPr>
-          <w:rFonts w:ascii="Times New Roman" w:hAnsi="Times New Roman"/>
-          <w:color w:val="000000"/>
-        </w:rPr>
-        <w:t xml:space="preserve"> UC này cho phép khách vãng lai vào hệ thống đăng ký trở thành thành viên theo thông tin mà khách hàng cung cấp.</w:t>
+          <w:i w:val="0"/>
+          <w:color w:val="1E3A8A"/>
+          <w:sz w:val="22"/>
+        </w:rPr>
+        <w:t xml:space="preserve">• </w:t>
+      </w:r>
+      <w:r>
+        <w:rPr>
+          <w:rFonts w:ascii="Times New Roman" w:hAnsi="Times New Roman"/>
+          <w:b/>
+          <w:i w:val="0"/>
+          <w:color w:val="0F172A"/>
+          <w:sz w:val="22"/>
+        </w:rPr>
+        <w:t xml:space="preserve">Profile management (Quản lý thông tin cá nhân &amp; Lối sống gốc): </w:t>
+      </w:r>
+      <w:r>
+        <w:rPr>
+          <w:rFonts w:ascii="Times New Roman" w:hAnsi="Times New Roman"/>
+          <w:b w:val="0"/>
+          <w:i w:val="0"/>
+          <w:color w:val="1E293B"/>
+          <w:sz w:val="22"/>
+        </w:rPr>
+        <w:t>Use case này cho phép người dùng cập nhật thông tin cá nhân (họ tên, số điện thoại, CCCD/CMND, ảnh đại diện avatar), thực hiện đổi mật khẩu bảo mật (mã hóa băm BCrypt) và làm khảo sát lối sống gốc 8 chiều (giờ giấc, hút thuốc, thú cưng, nấu ăn, sạch sẽ, dẫn bạn bè, tính cách...). Vector lối sống chuẩn hóa này được lưu trữ trong cơ sở dữ liệu làm dữ liệu nền tảng để tự động sao chép khi người dùng tạo bài đăng hoặc nộp đơn ở ghép. Đồng thời, cho phép người dùng đăng xuất khỏi hệ thống để xóa bỏ phiên làm việc.</w:t>
       </w:r>
     </w:p>
     <w:p>
       <w:pPr>
-        <w:spacing w:before="40" w:after="40" w:line="288" w:lineRule="auto"/>
-        <w:ind w:left="288"/>
+        <w:spacing w:before="60" w:after="80" w:line="288" w:lineRule="auto"/>
+        <w:ind w:left="360" w:hanging="360"/>
       </w:pPr>
       <w:r>
         <w:rPr>
           <w:rFonts w:ascii="Times New Roman" w:hAnsi="Times New Roman"/>
           <w:b/>
-          <w:color w:val="000000"/>
-        </w:rPr>
-        <w:t>Search (Tìm kiếm):</w:t>
-      </w:r>
-      <w:r>
-        <w:rPr>
-          <w:rFonts w:ascii="Times New Roman" w:hAnsi="Times New Roman"/>
-          <w:color w:val="000000"/>
-        </w:rPr>
-        <w:t xml:space="preserve"> UC này cho phép người dùng tìm kiếm phòng trọ hoặc bài đăng tìm bạn ở ghép dựa trên từ khóa khu vực, khoảng giá, vị trí bản đồ và bộ lọc tiêu chí lối sống.</w:t>
+          <w:i w:val="0"/>
+          <w:color w:val="1E3A8A"/>
+          <w:sz w:val="22"/>
+        </w:rPr>
+        <w:t xml:space="preserve">• </w:t>
+      </w:r>
+      <w:r>
+        <w:rPr>
+          <w:rFonts w:ascii="Times New Roman" w:hAnsi="Times New Roman"/>
+          <w:b/>
+          <w:i w:val="0"/>
+          <w:color w:val="0F172A"/>
+          <w:sz w:val="22"/>
+        </w:rPr>
+        <w:t xml:space="preserve">Search room (Tìm kiếm phòng trọ): </w:t>
+      </w:r>
+      <w:r>
+        <w:rPr>
+          <w:rFonts w:ascii="Times New Roman" w:hAnsi="Times New Roman"/>
+          <w:b w:val="0"/>
+          <w:i w:val="0"/>
+          <w:color w:val="1E293B"/>
+          <w:sz w:val="22"/>
+        </w:rPr>
+        <w:t>Use case này cho phép người dùng tìm kiếm và xem danh sách các phòng trọ đang còn trống (trạng thái AVAILABLE và is_public = true) dựa trên từ khóa, khu vực hành chính (Tỉnh/Thành phố, Phường/Xã), khoảng giá thuê, diện tích và tiện ích đi kèm. Kết quả được hiển thị đồng bộ hai chiều giữa danh sách thẻ phòng và bản đồ số Leaflet OpenStreetMap với các marker vị trí thực tế, cho phép nhấp xem chi tiết phòng, bảng giá dịch vụ và liên hệ chủ nhà.</w:t>
       </w:r>
     </w:p>
     <w:p>
       <w:pPr>
-        <w:spacing w:before="40" w:after="40" w:line="288" w:lineRule="auto"/>
-        <w:ind w:left="288"/>
+        <w:spacing w:before="60" w:after="80" w:line="288" w:lineRule="auto"/>
+        <w:ind w:left="360" w:hanging="360"/>
       </w:pPr>
       <w:r>
         <w:rPr>
           <w:rFonts w:ascii="Times New Roman" w:hAnsi="Times New Roman"/>
           <w:b/>
-          <w:color w:val="000000"/>
-        </w:rPr>
-        <w:t>Manage building (Quản lý tòa nhà):</w:t>
-      </w:r>
-      <w:r>
-        <w:rPr>
-          <w:rFonts w:ascii="Times New Roman" w:hAnsi="Times New Roman"/>
-          <w:color w:val="000000"/>
-        </w:rPr>
-        <w:t xml:space="preserve"> UC này cho phép chủ trọ quản lý thông tin các tòa nhà/khu trọ trong hệ thống (thêm, sửa, xóa, xem danh sách).</w:t>
+          <w:i w:val="0"/>
+          <w:color w:val="1E3A8A"/>
+          <w:sz w:val="22"/>
+        </w:rPr>
+        <w:t xml:space="preserve">• </w:t>
+      </w:r>
+      <w:r>
+        <w:rPr>
+          <w:rFonts w:ascii="Times New Roman" w:hAnsi="Times New Roman"/>
+          <w:b/>
+          <w:i w:val="0"/>
+          <w:color w:val="0F172A"/>
+          <w:sz w:val="22"/>
+        </w:rPr>
+        <w:t xml:space="preserve">Search post find roommate (Tìm kiếm bài đăng ở ghép &amp; Đối chiếu lối sống AI): </w:t>
+      </w:r>
+      <w:r>
+        <w:rPr>
+          <w:rFonts w:ascii="Times New Roman" w:hAnsi="Times New Roman"/>
+          <w:b w:val="0"/>
+          <w:i w:val="0"/>
+          <w:color w:val="1E293B"/>
+          <w:sz w:val="22"/>
+        </w:rPr>
+        <w:t>Use case này cho phép người thuê tìm kiếm các bài đăng tìm bạn ở ghép theo 2 mô hình thực tế: Đã có phòng trọ (HAS_ROOM) hoặc Chưa có phòng trọ theo tọa độ bản đồ và bán kính tìm kiếm (SEARCHING_ROOM). Hệ thống tự động so khớp vector lối sống của người tìm kiếm với vector của bài đăng bằng thuật toán khoảng cách Manhattan có trọng số và ràng buộc tiêu chí cứng (nếu hút thuốc khác biệt &gt;= 0.8, điểm tối đa chỉ đạt 50%) để hiển thị tỷ lệ phần trăm hòa hợp (% Matching Score) trực quan, giúp người thuê nhanh chóng tìm được bạn cùng phòng phù hợp.</w:t>
       </w:r>
     </w:p>
     <w:p>
       <w:pPr>
-        <w:spacing w:before="40" w:after="40" w:line="288" w:lineRule="auto"/>
-        <w:ind w:left="288"/>
+        <w:keepNext/>
+        <w:spacing w:before="240" w:after="80"/>
       </w:pPr>
       <w:r>
         <w:rPr>
           <w:rFonts w:ascii="Times New Roman" w:hAnsi="Times New Roman"/>
           <w:b/>
-          <w:color w:val="000000"/>
-        </w:rPr>
-        <w:t>Manage room (Quản lý phòng trọ):</w:t>
-      </w:r>
-      <w:r>
-        <w:rPr>
-          <w:rFonts w:ascii="Times New Roman" w:hAnsi="Times New Roman"/>
-          <w:color w:val="000000"/>
-        </w:rPr>
-        <w:t xml:space="preserve"> UC này cho phép chủ trọ quản lý thông tin các phòng trọ trong tòa nhà (thêm, sửa, xóa, theo dõi trạng thái còn trống hay đang thuê).</w:t>
+          <w:i w:val="0"/>
+          <w:color w:val="0F4C81"/>
+          <w:sz w:val="23"/>
+        </w:rPr>
+        <w:t>2. Nhóm Use case cho Tác nhân Landlord (Chủ trọ)</w:t>
       </w:r>
     </w:p>
     <w:p>
       <w:pPr>
-        <w:spacing w:before="40" w:after="40" w:line="288" w:lineRule="auto"/>
-        <w:ind w:left="288"/>
+        <w:spacing w:before="60" w:after="80" w:line="288" w:lineRule="auto"/>
+        <w:ind w:left="360" w:hanging="360"/>
       </w:pPr>
       <w:r>
         <w:rPr>
           <w:rFonts w:ascii="Times New Roman" w:hAnsi="Times New Roman"/>
           <w:b/>
-          <w:color w:val="000000"/>
-        </w:rPr>
-        <w:lastRenderedPageBreak/>
-        <w:t>Manage utility service (Quản lý dịch vụ tiện ích):</w:t>
-      </w:r>
-      <w:r>
-        <w:rPr>
-          <w:rFonts w:ascii="Times New Roman" w:hAnsi="Times New Roman"/>
-          <w:color w:val="000000"/>
-        </w:rPr>
-        <w:t xml:space="preserve"> UC này cho phép chủ trọ quản lý bảng giá và định mức thu các loại dịch vụ tiện ích như điện, nước, internet, rác (thêm, sửa, xóa).</w:t>
+          <w:i w:val="0"/>
+          <w:color w:val="1E3A8A"/>
+          <w:sz w:val="22"/>
+        </w:rPr>
+        <w:t xml:space="preserve">• </w:t>
+      </w:r>
+      <w:r>
+        <w:rPr>
+          <w:rFonts w:ascii="Times New Roman" w:hAnsi="Times New Roman"/>
+          <w:b/>
+          <w:i w:val="0"/>
+          <w:color w:val="0F172A"/>
+          <w:sz w:val="22"/>
+        </w:rPr>
+        <w:t xml:space="preserve">Building management (Quản lý tòa nhà / khu trọ): </w:t>
+      </w:r>
+      <w:r>
+        <w:rPr>
+          <w:rFonts w:ascii="Times New Roman" w:hAnsi="Times New Roman"/>
+          <w:b w:val="0"/>
+          <w:i w:val="0"/>
+          <w:color w:val="1E293B"/>
+          <w:sz w:val="22"/>
+        </w:rPr>
+        <w:t>Use case này cho phép chủ trọ quản lý danh sách các tòa nhà/khu trọ thuộc quyền sở hữu của mình, theo dõi tổng số phòng, số phòng đang có khách và số phòng còn trống. Chủ trọ có thể thêm mới hoặc cập nhật tòa nhà thông qua giao diện trực quan 2 cột tỷ lệ 6:4 (bản đồ Leaflet 60% có ghim tọa độ và nút lấy GPS hiện tại kết hợp cột nhập địa chỉ 40% tự động nhận diện vị trí), thiết lập số tầng và quy định chung của tòa nhà; đồng thời thực hiện xóa tòa nhà khi không còn phòng trọ nào đang cho thuê.</w:t>
       </w:r>
     </w:p>
     <w:p>
       <w:pPr>
-        <w:spacing w:before="40" w:after="40" w:line="288" w:lineRule="auto"/>
-        <w:ind w:left="288"/>
+        <w:spacing w:before="60" w:after="80" w:line="288" w:lineRule="auto"/>
+        <w:ind w:left="360" w:hanging="360"/>
       </w:pPr>
       <w:r>
         <w:rPr>
           <w:rFonts w:ascii="Times New Roman" w:hAnsi="Times New Roman"/>
           <w:b/>
-          <w:color w:val="000000"/>
-        </w:rPr>
-        <w:t>Manage tenant (Quản lý khách thuê):</w:t>
-      </w:r>
-      <w:r>
-        <w:rPr>
-          <w:rFonts w:ascii="Times New Roman" w:hAnsi="Times New Roman"/>
-          <w:color w:val="000000"/>
-        </w:rPr>
-        <w:t xml:space="preserve"> UC này cho phép chủ trọ quản lý thông tin khách thuê phòng (thêm, sửa, xóa) và gửi lời mời liên kết tài khoản hệ thống tới khách thuê.</w:t>
+          <w:i w:val="0"/>
+          <w:color w:val="1E3A8A"/>
+          <w:sz w:val="22"/>
+        </w:rPr>
+        <w:t xml:space="preserve">• </w:t>
+      </w:r>
+      <w:r>
+        <w:rPr>
+          <w:rFonts w:ascii="Times New Roman" w:hAnsi="Times New Roman"/>
+          <w:b/>
+          <w:i w:val="0"/>
+          <w:color w:val="0F172A"/>
+          <w:sz w:val="22"/>
+        </w:rPr>
+        <w:t xml:space="preserve">Room management (Quản lý phòng trọ): </w:t>
+      </w:r>
+      <w:r>
+        <w:rPr>
+          <w:rFonts w:ascii="Times New Roman" w:hAnsi="Times New Roman"/>
+          <w:b w:val="0"/>
+          <w:i w:val="0"/>
+          <w:color w:val="1E293B"/>
+          <w:sz w:val="22"/>
+        </w:rPr>
+        <w:t>Use case này cho phép chủ trọ quản lý toàn bộ danh sách phòng trọ, lọc theo tòa nhà và trạng thái (AVAILABLE, RENTED, MAINTENANCE, DISABLED). Chủ trọ có thể tạo mới phòng trọ với giao diện tích hợp bản đồ 2 cột 6:4 (kế thừa vị trí tòa nhà hoặc chọn vị trí phòng độc lập), cấu hình tầng, diện tích, sức chứa tối đa, giá thuê niêm yết, tiền đặt cọc tiêu chuẩn, danh mục tiện nghi có sẵn và các dịch vụ tiện ích áp dụng; cập nhật thông tin phòng, chuyển trạng thái bảo trì/sửa chữa và xóa phòng khi không có hợp đồng thuê hoạt động.</w:t>
       </w:r>
     </w:p>
     <w:p>
       <w:pPr>
-        <w:spacing w:before="40" w:after="40" w:line="288" w:lineRule="auto"/>
-        <w:ind w:left="288"/>
+        <w:spacing w:before="60" w:after="80" w:line="288" w:lineRule="auto"/>
+        <w:ind w:left="360" w:hanging="360"/>
       </w:pPr>
       <w:r>
         <w:rPr>
           <w:rFonts w:ascii="Times New Roman" w:hAnsi="Times New Roman"/>
           <w:b/>
-          <w:color w:val="000000"/>
-        </w:rPr>
-        <w:t>Manage contract (Quản lý hợp đồng):</w:t>
-      </w:r>
-      <w:r>
-        <w:rPr>
-          <w:rFonts w:ascii="Times New Roman" w:hAnsi="Times New Roman"/>
-          <w:color w:val="000000"/>
-        </w:rPr>
-        <w:t xml:space="preserve"> UC này cho phép chủ trọ tạo lập hợp đồng thuê phòng mới, cập nhật điều khoản và thực hiện thanh lý hợp đồng (nghiệm thu cơ sở vật chất, chốt điện nước, hoàn trả cọc) khi khách trả phòng.</w:t>
+          <w:i w:val="0"/>
+          <w:color w:val="1E3A8A"/>
+          <w:sz w:val="22"/>
+        </w:rPr>
+        <w:t xml:space="preserve">• </w:t>
+      </w:r>
+      <w:r>
+        <w:rPr>
+          <w:rFonts w:ascii="Times New Roman" w:hAnsi="Times New Roman"/>
+          <w:b/>
+          <w:i w:val="0"/>
+          <w:color w:val="0F172A"/>
+          <w:sz w:val="22"/>
+        </w:rPr>
+        <w:t xml:space="preserve">Service management (Quản lý dịch vụ tiện ích): </w:t>
+      </w:r>
+      <w:r>
+        <w:rPr>
+          <w:rFonts w:ascii="Times New Roman" w:hAnsi="Times New Roman"/>
+          <w:b w:val="0"/>
+          <w:i w:val="0"/>
+          <w:color w:val="1E293B"/>
+          <w:sz w:val="22"/>
+        </w:rPr>
+        <w:t>Use case này cho phép chủ trọ cấu hình bảng giá và phương thức tính phí cho từng loại dịch vụ tiện ích (Điện, Nước, Internet, Thu gom rác, Gửi xe, Dịch vụ chung...) theo 3 phương thức tính cước thực tế: theo chỉ số đồng hồ (PER_INDEX - áp dụng cho Điện, Nước máy), cố định theo phòng (PER_ROOM - áp dụng cho Mạng, Vệ sinh), hoặc theo số đầu người (PER_PERSON - áp dụng cho Nước khoán, Gửi xe). Dữ liệu này làm căn cứ tính toán tự động trong hợp đồng và hóa đơn tháng.</w:t>
       </w:r>
     </w:p>
     <w:p>
       <w:pPr>
-        <w:spacing w:before="40" w:after="40" w:line="288" w:lineRule="auto"/>
-        <w:ind w:left="288"/>
+        <w:spacing w:before="60" w:after="80" w:line="288" w:lineRule="auto"/>
+        <w:ind w:left="360" w:hanging="360"/>
       </w:pPr>
       <w:r>
         <w:rPr>
           <w:rFonts w:ascii="Times New Roman" w:hAnsi="Times New Roman"/>
           <w:b/>
-          <w:color w:val="000000"/>
-        </w:rPr>
-        <w:t>Monthly billing (Tính tiền phòng theo tháng):</w:t>
-      </w:r>
-      <w:r>
-        <w:rPr>
-          <w:rFonts w:ascii="Times New Roman" w:hAnsi="Times New Roman"/>
-          <w:color w:val="000000"/>
-        </w:rPr>
-        <w:t xml:space="preserve"> UC này cho phép chủ trọ chốt số điện nước, lập hóa đơn tháng, điều chỉnh sai sót và xác nhận thanh toán (gạch nợ) khi khách nộp tiền.</w:t>
+          <w:i w:val="0"/>
+          <w:color w:val="1E3A8A"/>
+          <w:sz w:val="22"/>
+        </w:rPr>
+        <w:t xml:space="preserve">• </w:t>
+      </w:r>
+      <w:r>
+        <w:rPr>
+          <w:rFonts w:ascii="Times New Roman" w:hAnsi="Times New Roman"/>
+          <w:b/>
+          <w:i w:val="0"/>
+          <w:color w:val="0F172A"/>
+          <w:sz w:val="22"/>
+        </w:rPr>
+        <w:t xml:space="preserve">Tenant management (Quản lý khách thuê): </w:t>
+      </w:r>
+      <w:r>
+        <w:rPr>
+          <w:rFonts w:ascii="Times New Roman" w:hAnsi="Times New Roman"/>
+          <w:b w:val="0"/>
+          <w:i w:val="0"/>
+          <w:color w:val="1E293B"/>
+          <w:sz w:val="22"/>
+        </w:rPr>
+        <w:t>Use case này cho phép chủ trọ quản lý hồ sơ cư trú của khách thuê tại các phòng trọ (họ tên, SĐT, CCCD/CMND, ngày sinh, quê quán, ngày vào ở), phân định rõ vai trò Người đại diện hợp đồng (is_representative = true) chịu trách nhiệm pháp lý và các thành viên cùng phòng, kiểm soát giới hạn sức chứa tối đa của phòng, cập nhật thông tin hoặc xóa khách thuê khi chuyển đi.</w:t>
       </w:r>
     </w:p>
     <w:p>
       <w:pPr>
-        <w:spacing w:before="40" w:after="40" w:line="288" w:lineRule="auto"/>
-        <w:ind w:left="288"/>
+        <w:spacing w:before="60" w:after="80" w:line="288" w:lineRule="auto"/>
+        <w:ind w:left="360" w:hanging="360"/>
       </w:pPr>
       <w:r>
         <w:rPr>
           <w:rFonts w:ascii="Times New Roman" w:hAnsi="Times New Roman"/>
           <w:b/>
-          <w:color w:val="000000"/>
-        </w:rPr>
-        <w:t>Handle complaint (Xử lý khiếu nại):</w:t>
-      </w:r>
-      <w:r>
-        <w:rPr>
-          <w:rFonts w:ascii="Times New Roman" w:hAnsi="Times New Roman"/>
-          <w:color w:val="000000"/>
-        </w:rPr>
-        <w:t xml:space="preserve"> UC này cho phép chủ trọ tiếp nhận, điều động thợ sửa chữa và cập nhật tiến độ giải quyết các khiếu nại/sự cố từ khách thuê gửi lên.</w:t>
+          <w:i w:val="0"/>
+          <w:color w:val="1E3A8A"/>
+          <w:sz w:val="22"/>
+        </w:rPr>
+        <w:t xml:space="preserve">• </w:t>
+      </w:r>
+      <w:r>
+        <w:rPr>
+          <w:rFonts w:ascii="Times New Roman" w:hAnsi="Times New Roman"/>
+          <w:b/>
+          <w:i w:val="0"/>
+          <w:color w:val="0F172A"/>
+          <w:sz w:val="22"/>
+        </w:rPr>
+        <w:t xml:space="preserve">Link tenant (Liên kết tài khoản người thuê - Phía Chủ trọ): </w:t>
+      </w:r>
+      <w:r>
+        <w:rPr>
+          <w:rFonts w:ascii="Times New Roman" w:hAnsi="Times New Roman"/>
+          <w:b w:val="0"/>
+          <w:i w:val="0"/>
+          <w:color w:val="1E293B"/>
+          <w:sz w:val="22"/>
+        </w:rPr>
+        <w:t>Use case này cho phép chủ trọ gửi lời mời liên kết tài khoản hệ thống tới khách thuê phòng thông qua số điện thoại hoặc email. Hệ thống theo dõi trạng thái lời mời (PENDING -&gt; LINKED), cho phép chủ trọ hủy lời mời khi cần, và tự động liên kết tài khoản người dùng StayConnect của khách thuê với hồ sơ phòng trọ khi khách bấm xác nhận đồng ý.</w:t>
       </w:r>
     </w:p>
     <w:p>
       <w:pPr>
-        <w:spacing w:before="40" w:after="40" w:line="288" w:lineRule="auto"/>
-        <w:ind w:left="288"/>
+        <w:spacing w:before="60" w:after="80" w:line="288" w:lineRule="auto"/>
+        <w:ind w:left="360" w:hanging="360"/>
       </w:pPr>
       <w:r>
         <w:rPr>
           <w:rFonts w:ascii="Times New Roman" w:hAnsi="Times New Roman"/>
           <w:b/>
-          <w:color w:val="000000"/>
-        </w:rPr>
-        <w:t>View Landlord Dashboard (Xem thống kê chủ trọ):</w:t>
-      </w:r>
-      <w:r>
-        <w:rPr>
-          <w:rFonts w:ascii="Times New Roman" w:hAnsi="Times New Roman"/>
-          <w:color w:val="000000"/>
-        </w:rPr>
-        <w:t xml:space="preserve"> UC này cho phép chủ trọ xem các loại báo cáo thống kê về doanh thu hàng tháng, tỷ lệ lấp đầy phòng và danh sách phòng nợ tiền trọ.</w:t>
+          <w:i w:val="0"/>
+          <w:color w:val="1E3A8A"/>
+          <w:sz w:val="22"/>
+        </w:rPr>
+        <w:t xml:space="preserve">• </w:t>
+      </w:r>
+      <w:r>
+        <w:rPr>
+          <w:rFonts w:ascii="Times New Roman" w:hAnsi="Times New Roman"/>
+          <w:b/>
+          <w:i w:val="0"/>
+          <w:color w:val="0F172A"/>
+          <w:sz w:val="22"/>
+        </w:rPr>
+        <w:t xml:space="preserve">Contract management (Quản lý hợp đồng thuê phòng): </w:t>
+      </w:r>
+      <w:r>
+        <w:rPr>
+          <w:rFonts w:ascii="Times New Roman" w:hAnsi="Times New Roman"/>
+          <w:b w:val="0"/>
+          <w:i w:val="0"/>
+          <w:color w:val="1E293B"/>
+          <w:sz w:val="22"/>
+        </w:rPr>
+        <w:t>Use case này cho phép chủ trọ tạo lập hợp đồng thuê phòng mới cho phòng còn trống (chọn khách thuê đại diện, thời hạn thuê, giá thuê thực tế, tiền cọc, chốt chỉ số điện nước ban đầu và dịch vụ áp dụng), hệ thống tự động chuyển trạng thái phòng sang RENTED và hợp đồng sang ACTIVE. Khi hợp đồng sắp hết hạn trong 30 ngày (EXPIRING_SOON), chủ trọ có thể gia hạn hợp đồng; khi khách dọn đi, chủ trọ thực hiện thanh lý hợp đồng (TERMINATED): chốt điện nước cuối kỳ, khấu trừ hư hỏng vào tiền cọc, hoàn trả tiền thừa cho khách và tự động giải phóng phòng về trạng thái AVAILABLE.</w:t>
       </w:r>
     </w:p>
     <w:p>
       <w:pPr>
-        <w:spacing w:before="40" w:after="40" w:line="288" w:lineRule="auto"/>
-        <w:ind w:left="288"/>
+        <w:spacing w:before="60" w:after="80" w:line="288" w:lineRule="auto"/>
+        <w:ind w:left="360" w:hanging="360"/>
       </w:pPr>
       <w:r>
         <w:rPr>
           <w:rFonts w:ascii="Times New Roman" w:hAnsi="Times New Roman"/>
           <w:b/>
-          <w:color w:val="000000"/>
-        </w:rPr>
-        <w:t>Manage roommate post (Quản lý bài đăng ở ghép):</w:t>
-      </w:r>
-      <w:r>
-        <w:rPr>
-          <w:rFonts w:ascii="Times New Roman" w:hAnsi="Times New Roman"/>
-          <w:color w:val="000000"/>
-        </w:rPr>
-        <w:t xml:space="preserve"> UC này cho phép người thuê tạo bài đăng tìm bạn ở ghép (khi đã có phòng trọ thực tế hoặc phòng ảo; hoặc khi chưa có phòng theo tọa độ bản đồ và bán kính tìm kiếm), chỉnh sửa và đóng bài đăng khi đã đủ người.</w:t>
+          <w:i w:val="0"/>
+          <w:color w:val="1E3A8A"/>
+          <w:sz w:val="22"/>
+        </w:rPr>
+        <w:t xml:space="preserve">• </w:t>
+      </w:r>
+      <w:r>
+        <w:rPr>
+          <w:rFonts w:ascii="Times New Roman" w:hAnsi="Times New Roman"/>
+          <w:b/>
+          <w:i w:val="0"/>
+          <w:color w:val="0F172A"/>
+          <w:sz w:val="22"/>
+        </w:rPr>
+        <w:t xml:space="preserve">Invoice management (Quản lý hóa đơn &amp; Thu tiền trọ): </w:t>
+      </w:r>
+      <w:r>
+        <w:rPr>
+          <w:rFonts w:ascii="Times New Roman" w:hAnsi="Times New Roman"/>
+          <w:b w:val="0"/>
+          <w:i w:val="0"/>
+          <w:color w:val="1E293B"/>
+          <w:sz w:val="22"/>
+        </w:rPr>
+        <w:t>Use case này cho phép chủ trọ lập hóa đơn tiền phòng hàng tháng tự động: hệ thống tự động điền tiền phòng và dịch vụ cố định, chủ trọ chỉ cần nhập chỉ số điện mới và nước mới để hệ thống tự tính sản lượng tiêu thụ và nhân đơn giá, bổ sung phụ thu/giảm trừ phát sinh. Hóa đơn được phát hành kèm mã thanh toán VietQR động chuẩn Napas 247 (chứa đúng STK chủ trọ, số tiền và nội dung chuyển khoản); chủ trọ có thể điều chỉnh sai sót, xác nhận gạch nợ thanh toán (PAID) hoặc hủy hóa đơn lập sai.</w:t>
       </w:r>
     </w:p>
     <w:p>
       <w:pPr>
-        <w:spacing w:before="40" w:after="40" w:line="288" w:lineRule="auto"/>
-        <w:ind w:left="288"/>
+        <w:spacing w:before="60" w:after="80" w:line="288" w:lineRule="auto"/>
+        <w:ind w:left="360" w:hanging="360"/>
       </w:pPr>
       <w:r>
         <w:rPr>
           <w:rFonts w:ascii="Times New Roman" w:hAnsi="Times New Roman"/>
           <w:b/>
-          <w:color w:val="000000"/>
-        </w:rPr>
-        <w:t>Roommate matching (Ghép nhóm ở ghép):</w:t>
-      </w:r>
-      <w:r>
-        <w:rPr>
-          <w:rFonts w:ascii="Times New Roman" w:hAnsi="Times New Roman"/>
-          <w:color w:val="000000"/>
-        </w:rPr>
-        <w:t xml:space="preserve"> UC này cho phép người thuê xin gia nhập nhóm (nộp khảo sát lối sống), chủ bài đăng xem xét đối chiếu độ tương thích lối sống, duyệt thành viên vào nhóm (hệ thống tự cập nhật lối sống chung) và chốt nhóm hoàn thành.</w:t>
+          <w:i w:val="0"/>
+          <w:color w:val="1E3A8A"/>
+          <w:sz w:val="22"/>
+        </w:rPr>
+        <w:t xml:space="preserve">• </w:t>
+      </w:r>
+      <w:r>
+        <w:rPr>
+          <w:rFonts w:ascii="Times New Roman" w:hAnsi="Times New Roman"/>
+          <w:b/>
+          <w:i w:val="0"/>
+          <w:color w:val="0F172A"/>
+          <w:sz w:val="22"/>
+        </w:rPr>
+        <w:t xml:space="preserve">Dashboard (Chủ trọ) (Xem thống kê chủ trọ): </w:t>
+      </w:r>
+      <w:r>
+        <w:rPr>
+          <w:rFonts w:ascii="Times New Roman" w:hAnsi="Times New Roman"/>
+          <w:b w:val="0"/>
+          <w:i w:val="0"/>
+          <w:color w:val="1E293B"/>
+          <w:sz w:val="22"/>
+        </w:rPr>
+        <w:t>Use case này cho phép chủ trọ theo dõi bức tranh tài chính và vận hành thời gian thực: tổng doanh thu thực thu tháng này, doanh thu dự kiến, tiền nợ đọng quá hạn (OVERDUE), tỷ lệ thu hồi công nợ (%), tổng số phòng, số phòng đang thuê, tỷ lệ lấp đầy phòng (Occupancy Rate %), biểu đồ doanh thu 6 tháng gần nhất, cùng các danh sách cảnh báo công việc cần xử lý ngay (phòng nợ tiền trọ, hợp đồng sắp hết hạn trong 30 ngày, sự cố báo hỏng đang chờ xử lý).</w:t>
       </w:r>
     </w:p>
     <w:p>
       <w:pPr>
-        <w:spacing w:before="40" w:after="40" w:line="288" w:lineRule="auto"/>
-        <w:ind w:left="288"/>
+        <w:keepNext/>
+        <w:spacing w:before="240" w:after="80"/>
       </w:pPr>
       <w:r>
         <w:rPr>
           <w:rFonts w:ascii="Times New Roman" w:hAnsi="Times New Roman"/>
           <w:b/>
-          <w:color w:val="000000"/>
-        </w:rPr>
-        <w:t>Link room (Liên kết phòng trọ):</w:t>
-      </w:r>
-      <w:r>
-        <w:rPr>
-          <w:rFonts w:ascii="Times New Roman" w:hAnsi="Times New Roman"/>
-          <w:color w:val="000000"/>
-        </w:rPr>
-        <w:t xml:space="preserve"> UC này cho phép người thuê tiếp nhận và xác nhận lời mời liên kết phòng trọ từ chủ nhà để bắt đầu nhận hóa đơn và thông báo trực tiếp qua ứng dụng.</w:t>
+          <w:i w:val="0"/>
+          <w:color w:val="0F4C81"/>
+          <w:sz w:val="23"/>
+        </w:rPr>
+        <w:t>3. Nhóm Use case cho Tác nhân Tenant (Người thuê)</w:t>
       </w:r>
     </w:p>
     <w:p>
       <w:pPr>
-        <w:spacing w:before="40" w:after="40" w:line="288" w:lineRule="auto"/>
-        <w:ind w:left="288"/>
+        <w:spacing w:before="60" w:after="80" w:line="288" w:lineRule="auto"/>
+        <w:ind w:left="360" w:hanging="360"/>
       </w:pPr>
       <w:r>
         <w:rPr>
           <w:rFonts w:ascii="Times New Roman" w:hAnsi="Times New Roman"/>
           <w:b/>
-          <w:color w:val="000000"/>
-        </w:rPr>
-        <w:t>View rental history &amp; bills (Xem lịch sử thuê phòng &amp; hóa đơn):</w:t>
-      </w:r>
-      <w:r>
-        <w:rPr>
-          <w:rFonts w:ascii="Times New Roman" w:hAnsi="Times New Roman"/>
-          <w:color w:val="000000"/>
-        </w:rPr>
-        <w:t xml:space="preserve"> UC này cho phép người thuê xem lại thông tin hợp đồng đang ở, theo dõi chi tiết hóa đơn điện nước từng tháng và thanh toán nhanh bằng quét mã QR.</w:t>
+          <w:i w:val="0"/>
+          <w:color w:val="1E3A8A"/>
+          <w:sz w:val="22"/>
+        </w:rPr>
+        <w:t xml:space="preserve">• </w:t>
+      </w:r>
+      <w:r>
+        <w:rPr>
+          <w:rFonts w:ascii="Times New Roman" w:hAnsi="Times New Roman"/>
+          <w:b/>
+          <w:i w:val="0"/>
+          <w:color w:val="0F172A"/>
+          <w:sz w:val="22"/>
+        </w:rPr>
+        <w:t xml:space="preserve">Post find roommate management (Quản lý bài đăng ở ghép): </w:t>
+      </w:r>
+      <w:r>
+        <w:rPr>
+          <w:rFonts w:ascii="Times New Roman" w:hAnsi="Times New Roman"/>
+          <w:b w:val="0"/>
+          <w:i w:val="0"/>
+          <w:color w:val="1E293B"/>
+          <w:sz w:val="22"/>
+        </w:rPr>
+        <w:t>Use case này cho phép người thuê tạo bài đăng tìm bạn cùng phòng theo 2 hình thức: Đã có phòng trọ thực tế (HAS_ROOM - chọn phòng đang thuê, số người cần tìm, giá share mỗi người, hình ảnh phòng) hoặc Chưa có phòng (SEARCHING_ROOM - chọn tọa độ và bán kính bản đồ tìm kiếm, ngân sách dự kiến). Người thuê có thể thiết lập tiêu chí lối sống riêng cho từng bài đăng mà không làm ảnh hưởng hồ sơ cá nhân gốc, chỉnh sửa nội dung bài viết và đóng bài đăng (CLOSED) khi đã tìm đủ người.</w:t>
       </w:r>
     </w:p>
     <w:p>
       <w:pPr>
-        <w:spacing w:before="40" w:after="40" w:line="288" w:lineRule="auto"/>
-        <w:ind w:left="288"/>
+        <w:spacing w:before="60" w:after="80" w:line="288" w:lineRule="auto"/>
+        <w:ind w:left="360" w:hanging="360"/>
       </w:pPr>
       <w:r>
         <w:rPr>
           <w:rFonts w:ascii="Times New Roman" w:hAnsi="Times New Roman"/>
           <w:b/>
-          <w:color w:val="000000"/>
-        </w:rPr>
-        <w:t>Report incident (Báo hỏng &amp; Khiếu nại sự cố):</w:t>
-      </w:r>
-      <w:r>
-        <w:rPr>
-          <w:rFonts w:ascii="Times New Roman" w:hAnsi="Times New Roman"/>
-          <w:color w:val="000000"/>
-        </w:rPr>
-        <w:t xml:space="preserve"> UC này cho phép người thuê gửi yêu cầu sửa chữa thiết bị (kèm hình ảnh hiện trạng) tới chủ nhà và theo dõi tiến độ khắc phục.</w:t>
+          <w:i w:val="0"/>
+          <w:color w:val="1E3A8A"/>
+          <w:sz w:val="22"/>
+        </w:rPr>
+        <w:t xml:space="preserve">• </w:t>
+      </w:r>
+      <w:r>
+        <w:rPr>
+          <w:rFonts w:ascii="Times New Roman" w:hAnsi="Times New Roman"/>
+          <w:b/>
+          <w:i w:val="0"/>
+          <w:color w:val="0F172A"/>
+          <w:sz w:val="22"/>
+        </w:rPr>
+        <w:t xml:space="preserve">Group find roommate management (Quản lý nhóm ở ghép &amp; Duyệt thành viên): </w:t>
+      </w:r>
+      <w:r>
+        <w:rPr>
+          <w:rFonts w:ascii="Times New Roman" w:hAnsi="Times New Roman"/>
+          <w:b w:val="0"/>
+          <w:i w:val="0"/>
+          <w:color w:val="1E293B"/>
+          <w:sz w:val="22"/>
+        </w:rPr>
+        <w:t>Use case này cho phép ứng viên nộp đơn xin gia nhập nhóm ở ghép (có thể tùy chỉnh đáp án lối sống cho phù hợp). Chủ bài đăng xem xét danh sách ứng viên được xếp hạng theo điểm hòa hợp lối sống AI, mở biểu đồ Radar đối chiếu chi tiết 8 tiêu chí sinh hoạt, bấm duyệt ứng viên vào nhóm (hệ thống tự động tính toán lại vector lối sống trung bình đại diện cho cả nhóm) hoặc từ chối đơn; và bấm chốt nhóm hoàn thành (COMPLETED) để đóng bài đăng khi đã đủ thành viên.</w:t>
       </w:r>
     </w:p>
     <w:p>
       <w:pPr>
-        <w:spacing w:before="40" w:after="40" w:line="288" w:lineRule="auto"/>
-        <w:ind w:left="288"/>
+        <w:spacing w:before="60" w:after="80" w:line="288" w:lineRule="auto"/>
+        <w:ind w:left="360" w:hanging="360"/>
       </w:pPr>
       <w:r>
         <w:rPr>
           <w:rFonts w:ascii="Times New Roman" w:hAnsi="Times New Roman"/>
           <w:b/>
-          <w:color w:val="000000"/>
-        </w:rPr>
-        <w:t>Manage user (Quản lý người dùng):</w:t>
-      </w:r>
-      <w:r>
-        <w:rPr>
-          <w:rFonts w:ascii="Times New Roman" w:hAnsi="Times New Roman"/>
-          <w:color w:val="000000"/>
-        </w:rPr>
-        <w:t xml:space="preserve"> UC này cho phép quản trị viên quản lý danh sách tài khoản người dùng toàn sàn (thêm mới, phân quyền vai trò, khóa hoặc mở khóa tài khoản vi phạm).</w:t>
+          <w:i w:val="0"/>
+          <w:color w:val="1E3A8A"/>
+          <w:sz w:val="22"/>
+        </w:rPr>
+        <w:t xml:space="preserve">• </w:t>
+      </w:r>
+      <w:r>
+        <w:rPr>
+          <w:rFonts w:ascii="Times New Roman" w:hAnsi="Times New Roman"/>
+          <w:b/>
+          <w:i w:val="0"/>
+          <w:color w:val="0F172A"/>
+          <w:sz w:val="22"/>
+        </w:rPr>
+        <w:t xml:space="preserve">Link tenant (Xác nhận liên kết phòng trọ - Phía Người thuê): </w:t>
+      </w:r>
+      <w:r>
+        <w:rPr>
+          <w:rFonts w:ascii="Times New Roman" w:hAnsi="Times New Roman"/>
+          <w:b w:val="0"/>
+          <w:i w:val="0"/>
+          <w:color w:val="1E293B"/>
+          <w:sz w:val="22"/>
+        </w:rPr>
+        <w:t>Use case này cho phép người thuê nhận thông báo lời mời liên kết phòng từ chủ nhà, xem thông tin chi tiết phòng trọ/chủ nhà và bấm xác nhận đồng ý để kích hoạt các tính năng quản lý phòng trọ (xem hợp đồng điện tử, nhận hóa đơn tiền phòng và gửi báo hỏng thiết bị).</w:t>
       </w:r>
     </w:p>
     <w:p>
       <w:pPr>
-        <w:spacing w:before="40" w:after="40" w:line="288" w:lineRule="auto"/>
-        <w:ind w:left="288"/>
+        <w:spacing w:before="60" w:after="80" w:line="288" w:lineRule="auto"/>
+        <w:ind w:left="360" w:hanging="360"/>
       </w:pPr>
       <w:r>
         <w:rPr>
           <w:rFonts w:ascii="Times New Roman" w:hAnsi="Times New Roman"/>
           <w:b/>
-          <w:color w:val="000000"/>
-        </w:rPr>
-        <w:t>Manage master data (Quản lý Master Data):</w:t>
-      </w:r>
-      <w:r>
-        <w:rPr>
-          <w:rFonts w:ascii="Times New Roman" w:hAnsi="Times New Roman"/>
-          <w:color w:val="000000"/>
-        </w:rPr>
-        <w:t xml:space="preserve"> UC này cho phép quản trị viên quản lý các dữ liệu dùng chung của hệ thống (danh mục tiện ích phòng, bộ tiêu chí khảo sát lối sống ở ghép và địa bàn hành chính).</w:t>
+          <w:i w:val="0"/>
+          <w:color w:val="1E3A8A"/>
+          <w:sz w:val="22"/>
+        </w:rPr>
+        <w:t xml:space="preserve">• </w:t>
+      </w:r>
+      <w:r>
+        <w:rPr>
+          <w:rFonts w:ascii="Times New Roman" w:hAnsi="Times New Roman"/>
+          <w:b/>
+          <w:i w:val="0"/>
+          <w:color w:val="0F172A"/>
+          <w:sz w:val="22"/>
+        </w:rPr>
+        <w:t xml:space="preserve">Tenant contract management (Xem hợp đồng phòng trọ): </w:t>
+      </w:r>
+      <w:r>
+        <w:rPr>
+          <w:rFonts w:ascii="Times New Roman" w:hAnsi="Times New Roman"/>
+          <w:b w:val="0"/>
+          <w:i w:val="0"/>
+          <w:color w:val="1E293B"/>
+          <w:sz w:val="22"/>
+        </w:rPr>
+        <w:t>Use case này cho phép người thuê (sau khi đã liên kết phòng trọ thành công với chủ trọ) tra cứu chi tiết hợp đồng thuê phòng điện tử đang có hiệu lực: mã hợp đồng, thời hạn thuê, giá thuê hàng tháng, số tiền đặt cọc đã nộp, bảng giá các dịch vụ tiện ích đã ký kết, các điều khoản quyền lợi - nghĩa vụ và quy định hoàn cọc khi trả phòng.</w:t>
       </w:r>
     </w:p>
     <w:p>
       <w:pPr>
-        <w:spacing w:before="40" w:after="40" w:line="288" w:lineRule="auto"/>
-        <w:ind w:left="288"/>
+        <w:spacing w:before="60" w:after="80" w:line="288" w:lineRule="auto"/>
+        <w:ind w:left="360" w:hanging="360"/>
       </w:pPr>
       <w:r>
         <w:rPr>
           <w:rFonts w:ascii="Times New Roman" w:hAnsi="Times New Roman"/>
           <w:b/>
-          <w:color w:val="000000"/>
-        </w:rPr>
-        <w:t>Approve dispute (Duyệt khiếu nại &amp; Kiểm duyệt vi phạm):</w:t>
-      </w:r>
-      <w:r>
-        <w:rPr>
-          <w:rFonts w:ascii="Times New Roman" w:hAnsi="Times New Roman"/>
-          <w:color w:val="000000"/>
-        </w:rPr>
-        <w:t xml:space="preserve"> UC này cho phép quản trị viên kiểm duyệt các tin báo lừa đảo tiền cọc, giải quyết tranh chấp giữa chủ trọ và người thuê, thực hiện gỡ bài đăng và khóa tài khoản vi phạm.</w:t>
+          <w:i w:val="0"/>
+          <w:color w:val="1E3A8A"/>
+          <w:sz w:val="22"/>
+        </w:rPr>
+        <w:t xml:space="preserve">• </w:t>
+      </w:r>
+      <w:r>
+        <w:rPr>
+          <w:rFonts w:ascii="Times New Roman" w:hAnsi="Times New Roman"/>
+          <w:b/>
+          <w:i w:val="0"/>
+          <w:color w:val="0F172A"/>
+          <w:sz w:val="22"/>
+        </w:rPr>
+        <w:t xml:space="preserve">Tenant invoice management (Xem lịch sử hóa đơn &amp; Thanh toán VietQR): </w:t>
+      </w:r>
+      <w:r>
+        <w:rPr>
+          <w:rFonts w:ascii="Times New Roman" w:hAnsi="Times New Roman"/>
+          <w:b w:val="0"/>
+          <w:i w:val="0"/>
+          <w:color w:val="1E293B"/>
+          <w:sz w:val="22"/>
+        </w:rPr>
+        <w:t>Use case này cho phép người thuê theo dõi toàn bộ hóa đơn tiền phòng từng tháng, xem bảng kê chi tiết từng dòng tiền (tiền phòng, số công tơ điện cũ/mới và số kWh tiêu thụ, số khối nước, các dịch vụ cố định và khoản giảm trừ). Người thuê có thể bấm 'Thanh toán VietQR' để quét mã QR thông minh tự động điền số tài khoản, số tiền và nội dung chuyển khoản để thanh toán tức thì qua mọi ứng dụng Mobile Banking / ví điện tử.</w:t>
       </w:r>
     </w:p>
     <w:p>
       <w:pPr>
-        <w:spacing w:before="40" w:after="40" w:line="288" w:lineRule="auto"/>
-        <w:ind w:left="288"/>
+        <w:spacing w:before="60" w:after="80" w:line="288" w:lineRule="auto"/>
+        <w:ind w:left="360" w:hanging="360"/>
       </w:pPr>
       <w:r>
         <w:rPr>
           <w:rFonts w:ascii="Times New Roman" w:hAnsi="Times New Roman"/>
           <w:b/>
-          <w:color w:val="000000"/>
-        </w:rPr>
-        <w:t>View Admin Dashboard (Xem thống kê toàn hệ thống):</w:t>
-      </w:r>
-      <w:r>
-        <w:rPr>
-          <w:rFonts w:ascii="Times New Roman" w:hAnsi="Times New Roman"/>
-          <w:color w:val="000000"/>
-        </w:rPr>
-        <w:t xml:space="preserve"> UC này cho phép quản trị viên xem các báo cáo thống kê tăng trưởng tài khoản, số lượng phòng trọ, bài đăng ghép phòng và tỷ lệ kết nối ở ghép thành công.</w:t>
+          <w:i w:val="0"/>
+          <w:color w:val="1E3A8A"/>
+          <w:sz w:val="22"/>
+        </w:rPr>
+        <w:t xml:space="preserve">• </w:t>
+      </w:r>
+      <w:r>
+        <w:rPr>
+          <w:rFonts w:ascii="Times New Roman" w:hAnsi="Times New Roman"/>
+          <w:b/>
+          <w:i w:val="0"/>
+          <w:color w:val="0F172A"/>
+          <w:sz w:val="22"/>
+        </w:rPr>
+        <w:t xml:space="preserve">Report landlord (Gửi khiếu nại chủ trọ &amp; Báo hỏng thiết bị): </w:t>
+      </w:r>
+      <w:r>
+        <w:rPr>
+          <w:rFonts w:ascii="Times New Roman" w:hAnsi="Times New Roman"/>
+          <w:b w:val="0"/>
+          <w:i w:val="0"/>
+          <w:color w:val="1E293B"/>
+          <w:sz w:val="22"/>
+        </w:rPr>
+        <w:t>Use case này cho phép người thuê tạo phiếu báo hỏng trang thiết bị trong phòng (điều hòa, bình nóng lạnh, hệ thống điện nước...) kèm mô tả, mức độ khẩn cấp (LOW, MEDIUM, HIGH) và hình ảnh chụp hiện trường thực tế để gửi trực tiếp cho chủ trọ tiếp nhận điều thợ sửa chữa; đồng thời cho phép gửi khiếu nại tố cáo lên Quản trị viên (Admin) nếu phát sinh tranh chấp cọc hoặc chủ nhà có hành vi vi phạm nghiêm trọng. Người thuê có thể theo dõi tiến độ xử lý sự cố xuyên suốt (PENDING -&gt; PROCESSING -&gt; RESOLVED).</w:t>
+      </w:r>
+    </w:p>
+    <w:p>
+      <w:pPr>
+        <w:keepNext/>
+        <w:spacing w:before="240" w:after="80"/>
+      </w:pPr>
+      <w:r>
+        <w:rPr>
+          <w:rFonts w:ascii="Times New Roman" w:hAnsi="Times New Roman"/>
+          <w:b/>
+          <w:i w:val="0"/>
+          <w:color w:val="0F4C81"/>
+          <w:sz w:val="23"/>
+        </w:rPr>
+        <w:t>4. Nhóm Use case cho Tác nhân Admin (Quản trị viên)</w:t>
+      </w:r>
+    </w:p>
+    <w:p>
+      <w:pPr>
+        <w:spacing w:before="60" w:after="80" w:line="288" w:lineRule="auto"/>
+        <w:ind w:left="360" w:hanging="360"/>
+      </w:pPr>
+      <w:r>
+        <w:rPr>
+          <w:rFonts w:ascii="Times New Roman" w:hAnsi="Times New Roman"/>
+          <w:b/>
+          <w:i w:val="0"/>
+          <w:color w:val="1E3A8A"/>
+          <w:sz w:val="22"/>
+        </w:rPr>
+        <w:t xml:space="preserve">• </w:t>
+      </w:r>
+      <w:r>
+        <w:rPr>
+          <w:rFonts w:ascii="Times New Roman" w:hAnsi="Times New Roman"/>
+          <w:b/>
+          <w:i w:val="0"/>
+          <w:color w:val="0F172A"/>
+          <w:sz w:val="22"/>
+        </w:rPr>
+        <w:t xml:space="preserve">User management (Quản lý người dùng toàn hệ thống): </w:t>
+      </w:r>
+      <w:r>
+        <w:rPr>
+          <w:rFonts w:ascii="Times New Roman" w:hAnsi="Times New Roman"/>
+          <w:b w:val="0"/>
+          <w:i w:val="0"/>
+          <w:color w:val="1E293B"/>
+          <w:sz w:val="22"/>
+        </w:rPr>
+        <w:t>Use case này cho phép quản trị viên quản lý danh sách tài khoản toàn sàn, lọc theo vai trò (ROLE_LANDLORD, ROLE_TENANT, ROLE_ADMIN) và trạng thái (ACTIVE, LOCKED), tìm kiếm theo tên/email/SĐT, tạo mới tài khoản nội bộ, phân quyền vai trò người dùng, thực hiện khóa tài khoản vi phạm chính sách (LOCKED - lập tức thu hồi phiên JWT) và mở khóa tài khoản khi đã giải quyết xong khiếu nại.</w:t>
+      </w:r>
+    </w:p>
+    <w:p>
+      <w:pPr>
+        <w:spacing w:before="60" w:after="80" w:line="288" w:lineRule="auto"/>
+        <w:ind w:left="360" w:hanging="360"/>
+      </w:pPr>
+      <w:r>
+        <w:rPr>
+          <w:rFonts w:ascii="Times New Roman" w:hAnsi="Times New Roman"/>
+          <w:b/>
+          <w:i w:val="0"/>
+          <w:color w:val="1E3A8A"/>
+          <w:sz w:val="22"/>
+        </w:rPr>
+        <w:t xml:space="preserve">• </w:t>
+      </w:r>
+      <w:r>
+        <w:rPr>
+          <w:rFonts w:ascii="Times New Roman" w:hAnsi="Times New Roman"/>
+          <w:b/>
+          <w:i w:val="0"/>
+          <w:color w:val="0F172A"/>
+          <w:sz w:val="22"/>
+        </w:rPr>
+        <w:t xml:space="preserve">Report management (Quản lý khiếu nại &amp; Xử lý vi phạm toàn sàn): </w:t>
+      </w:r>
+      <w:r>
+        <w:rPr>
+          <w:rFonts w:ascii="Times New Roman" w:hAnsi="Times New Roman"/>
+          <w:b w:val="0"/>
+          <w:i w:val="0"/>
+          <w:color w:val="1E293B"/>
+          <w:sz w:val="22"/>
+        </w:rPr>
+        <w:t>Use case này cho phép quản trị viên tiếp nhận và phân xử các khiếu nại, tố cáo vi phạm toàn sàn từ người dùng (tố cáo bài đăng tin ảo, lừa đảo chiếm đoạt tiền cọc, tranh chấp hợp đồng). Admin kiểm tra hồ sơ bằng chứng, hình ảnh đính kèm và áp dụng chế tài xử lý: gỡ bỏ bài đăng vi phạm (DELETED), gửi cảnh báo hoặc khóa tài khoản bên vi phạm, và cập nhật trạng thái giải quyết khiếu nại (RESOLVED).</w:t>
+      </w:r>
+    </w:p>
+    <w:p>
+      <w:pPr>
+        <w:spacing w:before="60" w:after="80" w:line="288" w:lineRule="auto"/>
+        <w:ind w:left="360" w:hanging="360"/>
+      </w:pPr>
+      <w:r>
+        <w:rPr>
+          <w:rFonts w:ascii="Times New Roman" w:hAnsi="Times New Roman"/>
+          <w:b/>
+          <w:i w:val="0"/>
+          <w:color w:val="1E3A8A"/>
+          <w:sz w:val="22"/>
+        </w:rPr>
+        <w:t xml:space="preserve">• </w:t>
+      </w:r>
+      <w:r>
+        <w:rPr>
+          <w:rFonts w:ascii="Times New Roman" w:hAnsi="Times New Roman"/>
+          <w:b/>
+          <w:i w:val="0"/>
+          <w:color w:val="0F172A"/>
+          <w:sz w:val="22"/>
+        </w:rPr>
+        <w:t xml:space="preserve">Admin dashboard (Xem thống kê toàn hệ thống): </w:t>
+      </w:r>
+      <w:r>
+        <w:rPr>
+          <w:rFonts w:ascii="Times New Roman" w:hAnsi="Times New Roman"/>
+          <w:b w:val="0"/>
+          <w:i w:val="0"/>
+          <w:color w:val="1E293B"/>
+          <w:sz w:val="22"/>
+        </w:rPr>
+        <w:t>Use case này cho phép quản trị viên theo dõi bức tranh tổng quan về tình hình hoạt động của sàn StayConnect: báo cáo tăng trưởng tài khoản mới, cơ cấu Chủ trọ vs Người thuê, tổng số phòng trọ trên sàn và phân bố theo khu vực, thống kê hoạt động tìm bạn ở ghép và tỷ lệ kết nối thành công của thuật toán vector AI, số lượng khiếu nại phát sinh và tiến độ giải quyết tranh chấp trên toàn hệ thống.</w:t>
       </w:r>
     </w:p>
     <w:sectPr>
@@ -10146,6 +10875,119 @@
     </w:lvl>
   </w:abstractNum>
   <w:abstractNum w:abstractNumId="11" w15:restartNumberingAfterBreak="0">
+    <w:nsid w:val="494C2F1D"/>
+    <w:multiLevelType w:val="hybridMultilevel"/>
+    <w:tmpl w:val="4A145280"/>
+    <w:lvl w:ilvl="0" w:tplc="042A0001">
+      <w:start w:val="1"/>
+      <w:numFmt w:val="bullet"/>
+      <w:lvlText w:val=""/>
+      <w:lvlJc w:val="left"/>
+      <w:pPr>
+        <w:ind w:left="1008" w:hanging="360"/>
+      </w:pPr>
+      <w:rPr>
+        <w:rFonts w:ascii="Symbol" w:hAnsi="Symbol" w:hint="default"/>
+      </w:rPr>
+    </w:lvl>
+    <w:lvl w:ilvl="1" w:tplc="042A0003" w:tentative="1">
+      <w:start w:val="1"/>
+      <w:numFmt w:val="bullet"/>
+      <w:lvlText w:val="o"/>
+      <w:lvlJc w:val="left"/>
+      <w:pPr>
+        <w:ind w:left="1728" w:hanging="360"/>
+      </w:pPr>
+      <w:rPr>
+        <w:rFonts w:ascii="Courier New" w:hAnsi="Courier New" w:cs="Courier New" w:hint="default"/>
+      </w:rPr>
+    </w:lvl>
+    <w:lvl w:ilvl="2" w:tplc="042A0005" w:tentative="1">
+      <w:start w:val="1"/>
+      <w:numFmt w:val="bullet"/>
+      <w:lvlText w:val=""/>
+      <w:lvlJc w:val="left"/>
+      <w:pPr>
+        <w:ind w:left="2448" w:hanging="360"/>
+      </w:pPr>
+      <w:rPr>
+        <w:rFonts w:ascii="Wingdings" w:hAnsi="Wingdings" w:hint="default"/>
+      </w:rPr>
+    </w:lvl>
+    <w:lvl w:ilvl="3" w:tplc="042A0001" w:tentative="1">
+      <w:start w:val="1"/>
+      <w:numFmt w:val="bullet"/>
+      <w:lvlText w:val=""/>
+      <w:lvlJc w:val="left"/>
+      <w:pPr>
+        <w:ind w:left="3168" w:hanging="360"/>
+      </w:pPr>
+      <w:rPr>
+        <w:rFonts w:ascii="Symbol" w:hAnsi="Symbol" w:hint="default"/>
+      </w:rPr>
+    </w:lvl>
+    <w:lvl w:ilvl="4" w:tplc="042A0003" w:tentative="1">
+      <w:start w:val="1"/>
+      <w:numFmt w:val="bullet"/>
+      <w:lvlText w:val="o"/>
+      <w:lvlJc w:val="left"/>
+      <w:pPr>
+        <w:ind w:left="3888" w:hanging="360"/>
+      </w:pPr>
+      <w:rPr>
+        <w:rFonts w:ascii="Courier New" w:hAnsi="Courier New" w:cs="Courier New" w:hint="default"/>
+      </w:rPr>
+    </w:lvl>
+    <w:lvl w:ilvl="5" w:tplc="042A0005" w:tentative="1">
+      <w:start w:val="1"/>
+      <w:numFmt w:val="bullet"/>
+      <w:lvlText w:val=""/>
+      <w:lvlJc w:val="left"/>
+      <w:pPr>
+        <w:ind w:left="4608" w:hanging="360"/>
+      </w:pPr>
+      <w:rPr>
+        <w:rFonts w:ascii="Wingdings" w:hAnsi="Wingdings" w:hint="default"/>
+      </w:rPr>
+    </w:lvl>
+    <w:lvl w:ilvl="6" w:tplc="042A0001" w:tentative="1">
+      <w:start w:val="1"/>
+      <w:numFmt w:val="bullet"/>
+      <w:lvlText w:val=""/>
+      <w:lvlJc w:val="left"/>
+      <w:pPr>
+        <w:ind w:left="5328" w:hanging="360"/>
+      </w:pPr>
+      <w:rPr>
+        <w:rFonts w:ascii="Symbol" w:hAnsi="Symbol" w:hint="default"/>
+      </w:rPr>
+    </w:lvl>
+    <w:lvl w:ilvl="7" w:tplc="042A0003" w:tentative="1">
+      <w:start w:val="1"/>
+      <w:numFmt w:val="bullet"/>
+      <w:lvlText w:val="o"/>
+      <w:lvlJc w:val="left"/>
+      <w:pPr>
+        <w:ind w:left="6048" w:hanging="360"/>
+      </w:pPr>
+      <w:rPr>
+        <w:rFonts w:ascii="Courier New" w:hAnsi="Courier New" w:cs="Courier New" w:hint="default"/>
+      </w:rPr>
+    </w:lvl>
+    <w:lvl w:ilvl="8" w:tplc="042A0005" w:tentative="1">
+      <w:start w:val="1"/>
+      <w:numFmt w:val="bullet"/>
+      <w:lvlText w:val=""/>
+      <w:lvlJc w:val="left"/>
+      <w:pPr>
+        <w:ind w:left="6768" w:hanging="360"/>
+      </w:pPr>
+      <w:rPr>
+        <w:rFonts w:ascii="Wingdings" w:hAnsi="Wingdings" w:hint="default"/>
+      </w:rPr>
+    </w:lvl>
+  </w:abstractNum>
+  <w:abstractNum w:abstractNumId="12" w15:restartNumberingAfterBreak="0">
     <w:nsid w:val="59357D9D"/>
     <w:multiLevelType w:val="hybridMultilevel"/>
     <w:tmpl w:val="8860747C"/>
@@ -10292,6 +11134,9 @@
     <w:abstractNumId w:val="10"/>
   </w:num>
   <w:num w:numId="12" w16cid:durableId="1363897056">
+    <w:abstractNumId w:val="12"/>
+  </w:num>
+  <w:num w:numId="13" w16cid:durableId="136261886">
     <w:abstractNumId w:val="11"/>
   </w:num>
 </w:numbering>

</xml_diff>